<commit_message>
Artigo: simulação da regra de quebra e modelo de seleção ao tratamento (D-044)
Dois modelos sobre o tratamento congelado, sem tocar no SIH: Monte Carlo
do próprio detectar_quebra (falso positivo sob Poisson e gama-Poisson,
poder contra saltos de 2 a 20 vezes) e logit de seleção com validação
cruzada. Seções 2.6, 3.5 e 3.6 no artigo, figuras 5 e 6, tabelas 5 a 7,
REFORMS atualizado e D-044 no log de decisões.

Co-Authored-By: Claude Opus 5.5 <noreply@anthropic.com>
Claude-Session: https://claude.ai/code/session_01RX7RZhVGPJ1LaoYw9sFqDf
</commit_message>
<xml_diff>
--- a/artigo/artigo.docx
+++ b/artigo/artigo.docx
@@ -341,7 +341,7 @@
         <w:t xml:space="preserve"> </w:t>
       </w:r>
       <w:r>
-        <w:t xml:space="preserve">foram 965.714 internações de motociclistas em 2016–2023, das quais 62 (uma em 15.576) registram nexo ocupacional; o SUS pagou R$ 288 milhões com essas internações em 2025, enquanto o resultado operacional do iFood no mesmo ano foi de R$ 1,8 bilhão. A regra de quebra data 640 municípios de 20 a 100 mil habitantes entre 2017 e 2025, com falso positivo de 0,7% a 3,8% no placebo; 478 entram na janela balanceada de estimação.</w:t>
+        <w:t xml:space="preserve">foram 965.714 internações de motociclistas em 2016–2023, das quais 62 (uma em 15.576) registram nexo ocupacional; o SUS pagou R$ 288 milhões com essas internações em 2025, enquanto o resultado operacional do iFood no mesmo ano foi de R$ 1,8 bilhão. A regra de quebra data 640 municípios de 20 a 100 mil habitantes entre 2017 e 2025, com falso positivo de 0,7% a 3,8% no placebo; 478 entram na janela balanceada de estimação. Dois modelos complementares, sem uso do desfecho, avaliam o tratamento: uma simulação de Monte Carlo da regra reproduz o falso positivo observado abaixo de 100 mil habitantes (0,6% e 3,9% simulados contra 0,7% e 3,8% observados) e mostra que a regra é conservadora (detecta 22–54% dos saltos de 2 a 5 vezes em municípios de 50–100 mil); uma regressão logística de seleção (AUC de validação cruzada 0,91) mostra que Nordeste e Norte têm chance 17 a 34 vezes menor de receber data, mesmo controlando população e propensão pré-plataforma a abrir MEI.</w:t>
       </w:r>
       <w:r>
         <w:t xml:space="preserve"> </w:t>
@@ -489,7 +489,7 @@
       </w:r>
     </w:p>
     <w:bookmarkEnd w:id="20"/>
-    <w:bookmarkStart w:id="26" w:name="métodos"/>
+    <w:bookmarkStart w:id="27" w:name="métodos"/>
     <w:p>
       <w:pPr>
         <w:pStyle w:val="Heading1"/>
@@ -744,7 +744,7 @@
               <w:jc w:val="left"/>
             </w:pPr>
             <w:r>
-              <w:t xml:space="preserve">Regra de detecção de quebra (Poisson) com busca em grade de hiperparâmetros; especificação do estimador DiD escalonado</w:t>
+              <w:t xml:space="preserve">Regra de detecção de quebra (Poisson) com busca em grade de hiperparâmetros; especificação do estimador DiD escalonado; regressão logística de seleção ao tratamento</w:t>
             </w:r>
           </w:p>
         </w:tc>
@@ -762,7 +762,16 @@
               <w:t xml:space="preserve">src/vcemal/mei.py</w:t>
             </w:r>
             <w:r>
-              <w:t xml:space="preserve">, plano de análise §5</w:t>
+              <w:t xml:space="preserve">, plano de análise §5,</w:t>
+            </w:r>
+            <w:r>
+              <w:t xml:space="preserve"> </w:t>
+            </w:r>
+            <w:r>
+              <w:rPr>
+                <w:rStyle w:val="VerbatimChar"/>
+              </w:rPr>
+              <w:t xml:space="preserve">artigo/modelos_artigo.py</w:t>
             </w:r>
           </w:p>
         </w:tc>
@@ -788,7 +797,7 @@
               <w:jc w:val="left"/>
             </w:pPr>
             <w:r>
-              <w:t xml:space="preserve">Placebo pré-plataforma (2016), concordância com Wayback, auditoria cega pré-declarada, testes de falha do desenho</w:t>
+              <w:t xml:space="preserve">Placebo pré-plataforma (2016), concordância com Wayback, simulação de Monte Carlo da regra (falso positivo e poder), validação cruzada do modelo de seleção, auditoria cega pré-declarada, testes de falha do desenho</w:t>
             </w:r>
           </w:p>
         </w:tc>
@@ -816,6 +825,18 @@
                 <w:rStyle w:val="VerbatimChar"/>
               </w:rPr>
               <w:t xml:space="preserve">make auditoria</w:t>
+            </w:r>
+            <w:r>
+              <w:t xml:space="preserve">,</w:t>
+            </w:r>
+            <w:r>
+              <w:t xml:space="preserve"> </w:t>
+            </w:r>
+            <w:r>
+              <w:rPr>
+                <w:rStyle w:val="VerbatimChar"/>
+              </w:rPr>
+              <w:t xml:space="preserve">artigo/modelos_artigo.py</w:t>
             </w:r>
             <w:r>
               <w:t xml:space="preserve">, plano §6</w:t>
@@ -2776,14 +2797,13 @@
       </w:r>
     </w:p>
     <w:bookmarkEnd w:id="25"/>
-    <w:bookmarkEnd w:id="26"/>
-    <w:bookmarkStart w:id="43" w:name="resultados"/>
-    <w:p>
-      <w:pPr>
-        <w:pStyle w:val="Heading1"/>
-      </w:pPr>
-      <w:r>
-        <w:t xml:space="preserve">3. Resultados</w:t>
+    <w:bookmarkStart w:id="26" w:name="Xf2d9e1919c82b4317694da72f270f723557bb59"/>
+    <w:p>
+      <w:pPr>
+        <w:pStyle w:val="Heading2"/>
+      </w:pPr>
+      <w:r>
+        <w:t xml:space="preserve">2.6 Modelos complementares sobre o tratamento (exploratórios, sem desfecho)</w:t>
       </w:r>
     </w:p>
     <w:p>
@@ -2791,50 +2811,155 @@
         <w:pStyle w:val="FirstParagraph"/>
       </w:pPr>
       <w:r>
-        <w:t xml:space="preserve">Os resultados abaixo são descritivos ou referem-se à construção do tratamento.</w:t>
-      </w:r>
-      <w:r>
-        <w:t xml:space="preserve"> </w:t>
-      </w:r>
+        <w:t xml:space="preserve">Dois modelos avaliam o tratamento construído antes da estimação causal. Nenhum usa internações; ambos leem só o arquivo congelado e foram registrados no log de decisões como análise exploratória (D-044).</w:t>
+      </w:r>
+    </w:p>
+    <w:p>
+      <w:pPr>
+        <w:pStyle w:val="BodyText"/>
+      </w:pPr>
       <w:r>
         <w:rPr>
           <w:bCs/>
           <w:b/>
         </w:rPr>
-        <w:t xml:space="preserve">Nenhum cruza tratamento com desfecho</w:t>
-      </w:r>
-      <w:r>
-        <w:t xml:space="preserve">, por regra do pré-registro.</w:t>
-      </w:r>
-    </w:p>
-    <w:bookmarkStart w:id="27" w:name="carga-e-custo-público"/>
-    <w:p>
-      <w:pPr>
-        <w:pStyle w:val="Heading2"/>
-      </w:pPr>
-      <w:r>
-        <w:t xml:space="preserve">3.1 Carga e custo público</w:t>
+        <w:t xml:space="preserve">(a) Simulação de Monte Carlo da regra de quebra.</w:t>
+      </w:r>
+      <w:r>
+        <w:t xml:space="preserve"> </w:t>
+      </w:r>
+      <w:r>
+        <w:t xml:space="preserve">O mesmo código que gerou o tratamento (</w:t>
+      </w:r>
+      <w:r>
+        <w:rPr>
+          <w:rStyle w:val="VerbatimChar"/>
+        </w:rPr>
+        <w:t xml:space="preserve">vcemal.mei.detectar_quebra</w:t>
+      </w:r>
+      <w:r>
+        <w:t xml:space="preserve">) é aplicado a séries sintéticas. Para cada um dos 1.710 municípios, a taxa mensal de aberturas é a observada em 2015–2016 (antes de qualquer plataforma; piso de 0,5 abertura em 24 meses, como na regra). Dois experimentos:</w:t>
+      </w:r>
+    </w:p>
+    <w:p>
+      <w:pPr>
+        <w:numPr>
+          <w:ilvl w:val="0"/>
+          <w:numId w:val="1002"/>
+        </w:numPr>
+        <w:pStyle w:val="Compact"/>
+      </w:pPr>
+      <w:r>
+        <w:rPr>
+          <w:iCs/>
+          <w:i/>
+        </w:rPr>
+        <w:t xml:space="preserve">Falso positivo:</w:t>
+      </w:r>
+      <w:r>
+        <w:t xml:space="preserve"> </w:t>
+      </w:r>
+      <w:r>
+        <w:t xml:space="preserve">séries sem quebra, de 2014-01 a 2016-12, com 200 réplicas por município, contando quebras na janela do placebo (jan–jun/2016). O nulo é Poisson puro e, depois, gama-Poisson com choques mensais de variância relativa 0,25, 0,5 e 1,0, que representam aceleração local que não é plataforma.</w:t>
+      </w:r>
+    </w:p>
+    <w:p>
+      <w:pPr>
+        <w:numPr>
+          <w:ilvl w:val="0"/>
+          <w:numId w:val="1002"/>
+        </w:numPr>
+        <w:pStyle w:val="Compact"/>
+      </w:pPr>
+      <w:r>
+        <w:rPr>
+          <w:iCs/>
+          <w:i/>
+        </w:rPr>
+        <w:t xml:space="preserve">Poder:</w:t>
+      </w:r>
+      <w:r>
+        <w:t xml:space="preserve"> </w:t>
+      </w:r>
+      <w:r>
+        <w:t xml:space="preserve">séries de 2015-01 a 2025-12 com um salto de</w:t>
+      </w:r>
+      <w:r>
+        <w:t xml:space="preserve"> </w:t>
+      </w:r>
+      <w:r>
+        <w:rPr>
+          <w:iCs/>
+          <w:i/>
+        </w:rPr>
+        <w:t xml:space="preserve">r</w:t>
+      </w:r>
+      <w:r>
+        <w:t xml:space="preserve"> </w:t>
+      </w:r>
+      <w:r>
+        <w:t xml:space="preserve">vezes na taxa em 2019-01,</w:t>
+      </w:r>
+      <w:r>
+        <w:t xml:space="preserve"> </w:t>
+      </w:r>
+      <w:r>
+        <w:rPr>
+          <w:iCs/>
+          <w:i/>
+        </w:rPr>
+        <w:t xml:space="preserve">r</w:t>
+      </w:r>
+      <w:r>
+        <w:t xml:space="preserve"> </w:t>
+      </w:r>
+      <w:r>
+        <w:t xml:space="preserve">∈ {2, 3, 5, 10, 20}, com 50 réplicas por município de 20–100 mil. Acerto é a quebra datada entre 5 meses antes (a regra data o primeiro mês da janela com abertura) e 12 meses depois do salto; quebra antes disso é espúria e esconde a verdadeira, porque a regra fica com a primeira.</w:t>
       </w:r>
     </w:p>
     <w:p>
       <w:pPr>
         <w:pStyle w:val="FirstParagraph"/>
       </w:pPr>
-      <w:r>
-        <w:t xml:space="preserve">Em 2016–2023 o SUS registrou</w:t>
-      </w:r>
-      <w:r>
-        <w:t xml:space="preserve"> </w:t>
-      </w:r>
       <w:r>
         <w:rPr>
           <w:bCs/>
           <w:b/>
         </w:rPr>
-        <w:t xml:space="preserve">965.714 internações de motociclistas</w:t>
-      </w:r>
-      <w:r>
-        <w:t xml:space="preserve">; 145.761 só em 2023. O valor pago pelo SUS em 2023 foi de R$ 230,1 milhões nominais (R$ 1.575 por AIH). Como validação externa, a tabulação da Abramet sobre o mesmo SIH dá R$ 221,5 milhões (+3,9%) e R$ 1.561 por AIH (+0,9%); a diferença está na contagem, e a hipótese é safra do dado (reapresentações posteriores). Em 2025, a preços de dez/2025, o SUS pagou</w:t>
+        <w:t xml:space="preserve">(b) Modelo de seleção ao tratamento.</w:t>
+      </w:r>
+      <w:r>
+        <w:t xml:space="preserve"> </w:t>
+      </w:r>
+      <w:r>
+        <w:t xml:space="preserve">Entre os 1.391 municípios de 20–100 mil, uma regressão logística estima a probabilidade de receber data (</w:t>
+      </w:r>
+      <w:r>
+        <w:rPr>
+          <w:rStyle w:val="VerbatimChar"/>
+        </w:rPr>
+        <w:t xml:space="preserve">datado</w:t>
+      </w:r>
+      <w:r>
+        <w:t xml:space="preserve"> </w:t>
+      </w:r>
+      <w:r>
+        <w:t xml:space="preserve">= 1,</w:t>
+      </w:r>
+      <w:r>
+        <w:t xml:space="preserve"> </w:t>
+      </w:r>
+      <w:r>
+        <w:rPr>
+          <w:rStyle w:val="VerbatimChar"/>
+        </w:rPr>
+        <w:t xml:space="preserve">sem_quebra</w:t>
+      </w:r>
+      <w:r>
+        <w:t xml:space="preserve"> </w:t>
+      </w:r>
+      <w:r>
+        <w:t xml:space="preserve">= 0) em três especificações aninhadas: M1, log da população; M2, mais a grande região (referência: Sudeste); M3, mais o log das aberturas de MEI de entrega por ano em 2015–2016, que mede a propensão a formalizar entregadores</w:t>
       </w:r>
       <w:r>
         <w:t xml:space="preserve"> </w:t>
@@ -2844,6 +2969,99 @@
           <w:bCs/>
           <w:b/>
         </w:rPr>
+        <w:t xml:space="preserve">antes</w:t>
+      </w:r>
+      <w:r>
+        <w:t xml:space="preserve"> </w:t>
+      </w:r>
+      <w:r>
+        <w:t xml:space="preserve">das plataformas. Os erros-padrão são agrupados por UF (27 grupos). O poder preditivo é medido pela AUC em validação cruzada estratificada de 5 partes, repetida 10 vezes (semente 20261013). A pergunta não é causal: é se o desbalanço regional da Tabela 4 se explica por porte ou por propensão prévia à formalização — o que diria se os</w:t>
+      </w:r>
+      <w:r>
+        <w:t xml:space="preserve"> </w:t>
+      </w:r>
+      <w:r>
+        <w:rPr>
+          <w:rStyle w:val="VerbatimChar"/>
+        </w:rPr>
+        <w:t xml:space="preserve">sem_quebra</w:t>
+      </w:r>
+      <w:r>
+        <w:t xml:space="preserve"> </w:t>
+      </w:r>
+      <w:r>
+        <w:t xml:space="preserve">são bons controles.</w:t>
+      </w:r>
+    </w:p>
+    <w:bookmarkEnd w:id="26"/>
+    <w:bookmarkEnd w:id="27"/>
+    <w:bookmarkStart w:id="52" w:name="resultados"/>
+    <w:p>
+      <w:pPr>
+        <w:pStyle w:val="Heading1"/>
+      </w:pPr>
+      <w:r>
+        <w:t xml:space="preserve">3. Resultados</w:t>
+      </w:r>
+    </w:p>
+    <w:p>
+      <w:pPr>
+        <w:pStyle w:val="FirstParagraph"/>
+      </w:pPr>
+      <w:r>
+        <w:t xml:space="preserve">Os resultados abaixo são descritivos ou referem-se à construção do tratamento.</w:t>
+      </w:r>
+      <w:r>
+        <w:t xml:space="preserve"> </w:t>
+      </w:r>
+      <w:r>
+        <w:rPr>
+          <w:bCs/>
+          <w:b/>
+        </w:rPr>
+        <w:t xml:space="preserve">Nenhum cruza tratamento com desfecho</w:t>
+      </w:r>
+      <w:r>
+        <w:t xml:space="preserve">, por regra do pré-registro.</w:t>
+      </w:r>
+    </w:p>
+    <w:bookmarkStart w:id="28" w:name="carga-e-custo-público"/>
+    <w:p>
+      <w:pPr>
+        <w:pStyle w:val="Heading2"/>
+      </w:pPr>
+      <w:r>
+        <w:t xml:space="preserve">3.1 Carga e custo público</w:t>
+      </w:r>
+    </w:p>
+    <w:p>
+      <w:pPr>
+        <w:pStyle w:val="FirstParagraph"/>
+      </w:pPr>
+      <w:r>
+        <w:t xml:space="preserve">Em 2016–2023 o SUS registrou</w:t>
+      </w:r>
+      <w:r>
+        <w:t xml:space="preserve"> </w:t>
+      </w:r>
+      <w:r>
+        <w:rPr>
+          <w:bCs/>
+          <w:b/>
+        </w:rPr>
+        <w:t xml:space="preserve">965.714 internações de motociclistas</w:t>
+      </w:r>
+      <w:r>
+        <w:t xml:space="preserve">; 145.761 só em 2023. O valor pago pelo SUS em 2023 foi de R$ 230,1 milhões nominais (R$ 1.575 por AIH). Como validação externa, a tabulação da Abramet sobre o mesmo SIH dá R$ 221,5 milhões (+3,9%) e R$ 1.561 por AIH (+0,9%); a diferença está na contagem, e a hipótese é safra do dado (reapresentações posteriores). Em 2025, a preços de dez/2025, o SUS pagou</w:t>
+      </w:r>
+      <w:r>
+        <w:t xml:space="preserve"> </w:t>
+      </w:r>
+      <w:r>
+        <w:rPr>
+          <w:bCs/>
+          <w:b/>
+        </w:rPr>
         <w:t xml:space="preserve">R$ 288 milhões</w:t>
       </w:r>
       <w:r>
@@ -2858,8 +3076,8 @@
         <w:t xml:space="preserve">O valor pago é piso: a tabela SUS remunera abaixo do custo, e o componente hospitalar por ferido grave nos parâmetros do Ipea (TD 2565) é duas ordens de grandeza maior que o valor médio da AIH. Por isso o custo social (Ipea) é reportado à parte, como ordem de grandeza, e nunca somado ao valor pago.</w:t>
       </w:r>
     </w:p>
-    <w:bookmarkEnd w:id="27"/>
-    <w:bookmarkStart w:id="31" w:name="invisibilidade-ocupacional"/>
+    <w:bookmarkEnd w:id="28"/>
+    <w:bookmarkStart w:id="32" w:name="invisibilidade-ocupacional"/>
     <w:p>
       <w:pPr>
         <w:pStyle w:val="Heading2"/>
@@ -2932,18 +3150,18 @@
           <wp:inline>
             <wp:extent cx="4533900" cy="1660363"/>
             <wp:effectExtent b="0" l="0" r="0" t="0"/>
-            <wp:docPr descr="Uma internação de motociclista em 15.576 registra o trabalho como causa (SIH/SUS, 2016–2023)." title="" id="29" name="Picture"/>
+            <wp:docPr descr="Uma internação de motociclista em 15.576 registra o trabalho como causa (SIH/SUS, 2016–2023)." title="" id="30" name="Picture"/>
             <a:graphic>
               <a:graphicData uri="http://schemas.openxmlformats.org/drawingml/2006/picture">
                 <pic:pic>
                   <pic:nvPicPr>
-                    <pic:cNvPr descr="figuras/fig4_nexo.png" id="30" name="Picture"/>
+                    <pic:cNvPr descr="figuras/fig4_nexo.png" id="31" name="Picture"/>
                     <pic:cNvPicPr>
                       <a:picLocks noChangeArrowheads="1" noChangeAspect="1"/>
                     </pic:cNvPicPr>
                   </pic:nvPicPr>
                   <pic:blipFill>
-                    <a:blip r:embed="rId28"/>
+                    <a:blip r:embed="rId29"/>
                     <a:stretch>
                       <a:fillRect/>
                     </a:stretch>
@@ -2999,8 +3217,8 @@
         <w:t xml:space="preserve">, não de mudança de risco: a partir de nov/2023 a concessão por análise documental (Atestmed) passa a dominar, e o atestado registra o código V muito mais que a perícia (0,6–0,7 contra 0,03–0,13 por mil benefícios). Esse canal responde por 65% dos benefícios de motociclistas em 2024–2025; anos dos dois lados da quebra não se comparam pelo total.</w:t>
       </w:r>
     </w:p>
-    <w:bookmarkEnd w:id="31"/>
-    <w:bookmarkStart w:id="35" w:name="precariedade-e-lucro"/>
+    <w:bookmarkEnd w:id="32"/>
+    <w:bookmarkStart w:id="36" w:name="precariedade-e-lucro"/>
     <w:p>
       <w:pPr>
         <w:pStyle w:val="Heading2"/>
@@ -3401,18 +3619,18 @@
           <wp:inline>
             <wp:extent cx="5334000" cy="2274875"/>
             <wp:effectExtent b="0" l="0" r="0" t="0"/>
-            <wp:docPr descr="iFood segundo as planilhas de KPI da Prosus: resultado operacional em R$ de dez/2025 (esq.) e entregadores ativos e pedidos (dir.), por ano fiscal abril–março. A série de resultado emenda trading profit (até FY2024) e EBIT ajustado (a partir de FY2025)." title="" id="33" name="Picture"/>
+            <wp:docPr descr="iFood segundo as planilhas de KPI da Prosus: resultado operacional em R$ de dez/2025 (esq.) e entregadores ativos e pedidos (dir.), por ano fiscal abril–março. A série de resultado emenda trading profit (até FY2024) e EBIT ajustado (a partir de FY2025)." title="" id="34" name="Picture"/>
             <a:graphic>
               <a:graphicData uri="http://schemas.openxmlformats.org/drawingml/2006/picture">
                 <pic:pic>
                   <pic:nvPicPr>
-                    <pic:cNvPr descr="figuras/fig3_ifood.png" id="34" name="Picture"/>
+                    <pic:cNvPr descr="figuras/fig3_ifood.png" id="35" name="Picture"/>
                     <pic:cNvPicPr>
                       <a:picLocks noChangeArrowheads="1" noChangeAspect="1"/>
                     </pic:cNvPicPr>
                   </pic:nvPicPr>
                   <pic:blipFill>
-                    <a:blip r:embed="rId32"/>
+                    <a:blip r:embed="rId33"/>
                     <a:stretch>
                       <a:fillRect/>
                     </a:stretch>
@@ -3487,8 +3705,8 @@
         <w:t xml:space="preserve">o que o SUS pagou com todas as internações de motociclistas do país no mesmo ano (R$ 288 milhões, ambos em R$ de dez/2025). Com ~1,7 bilhão de pedidos no ano, menos de R$ 0,20 por pedido cobriria essa conta. Esse número dimensiona uma política, mas não a justifica: a fração das internações atribuível à plataforma é exatamente o que a estimação causal vai medir.</w:t>
       </w:r>
     </w:p>
-    <w:bookmarkEnd w:id="35"/>
-    <w:bookmarkStart w:id="42" w:name="o-tratamento-construído"/>
+    <w:bookmarkEnd w:id="36"/>
+    <w:bookmarkStart w:id="43" w:name="o-tratamento-construído"/>
     <w:p>
       <w:pPr>
         <w:pStyle w:val="Heading2"/>
@@ -4045,18 +4263,18 @@
           <wp:inline>
             <wp:extent cx="5067300" cy="2681622"/>
             <wp:effectExtent b="0" l="0" r="0" t="0"/>
-            <wp:docPr descr="Ano da quebra nos 640 municípios datado. Faixa cinza escura: 2017, estrato de risco de quebra espúria (antes da frota própria do iFood); cinza claro: 2021–2025, risco de contaminação pela entrega de comércio eletrônico." title="" id="37" name="Picture"/>
+            <wp:docPr descr="Ano da quebra nos 640 municípios datado. Faixa cinza escura: 2017, estrato de risco de quebra espúria (antes da frota própria do iFood); cinza claro: 2021–2025, risco de contaminação pela entrega de comércio eletrônico." title="" id="38" name="Picture"/>
             <a:graphic>
               <a:graphicData uri="http://schemas.openxmlformats.org/drawingml/2006/picture">
                 <pic:pic>
                   <pic:nvPicPr>
-                    <pic:cNvPr descr="figuras/fig1_coortes.png" id="38" name="Picture"/>
+                    <pic:cNvPr descr="figuras/fig1_coortes.png" id="39" name="Picture"/>
                     <pic:cNvPicPr>
                       <a:picLocks noChangeArrowheads="1" noChangeAspect="1"/>
                     </pic:cNvPicPr>
                   </pic:nvPicPr>
                   <pic:blipFill>
-                    <a:blip r:embed="rId36"/>
+                    <a:blip r:embed="rId37"/>
                     <a:stretch>
                       <a:fillRect/>
                     </a:stretch>
@@ -4152,18 +4370,18 @@
           <wp:inline>
             <wp:extent cx="5065776" cy="2566416"/>
             <wp:effectExtent b="0" l="0" r="0" t="0"/>
-            <wp:docPr descr="Proporção acumulada de municípios de 20–100 mil habitantes já tratados. Em verde, as coortes que cabem na janela balanceada de estimação." title="" id="40" name="Picture"/>
+            <wp:docPr descr="Proporção acumulada de municípios de 20–100 mil habitantes já tratados. Em verde, as coortes que cabem na janela balanceada de estimação." title="" id="41" name="Picture"/>
             <a:graphic>
               <a:graphicData uri="http://schemas.openxmlformats.org/drawingml/2006/picture">
                 <pic:pic>
                   <pic:nvPicPr>
-                    <pic:cNvPr descr="figuras/fig2_adocao_acumulada.png" id="41" name="Picture"/>
+                    <pic:cNvPr descr="figuras/fig2_adocao_acumulada.png" id="42" name="Picture"/>
                     <pic:cNvPicPr>
                       <a:picLocks noChangeArrowheads="1" noChangeAspect="1"/>
                     </pic:cNvPicPr>
                   </pic:nvPicPr>
                   <pic:blipFill>
-                    <a:blip r:embed="rId39"/>
+                    <a:blip r:embed="rId40"/>
                     <a:stretch>
                       <a:fillRect/>
                     </a:stretch>
@@ -4693,15 +4911,14 @@
         <w:t xml:space="preserve">nordestinos estaria tratada sem ser vista. A seção 4 discute a consequência.</w:t>
       </w:r>
     </w:p>
-    <w:bookmarkEnd w:id="42"/>
     <w:bookmarkEnd w:id="43"/>
-    <w:bookmarkStart w:id="44" w:name="discussão"/>
-    <w:p>
-      <w:pPr>
-        <w:pStyle w:val="Heading1"/>
-      </w:pPr>
-      <w:r>
-        <w:t xml:space="preserve">4. Discussão</w:t>
+    <w:bookmarkStart w:id="47" w:name="X6b778cbaed6e943f7b53f3a5497b82e1877f970"/>
+    <w:p>
+      <w:pPr>
+        <w:pStyle w:val="Heading2"/>
+      </w:pPr>
+      <w:r>
+        <w:t xml:space="preserve">3.5 A regra simulada: calibrada onde é usada, conservadora e incapaz de datar cidades grandes</w:t>
       </w:r>
     </w:p>
     <w:p>
@@ -4713,31 +4930,414 @@
           <w:bCs/>
           <w:b/>
         </w:rPr>
-        <w:t xml:space="preserve">O que já se sabe.</w:t>
-      </w:r>
-      <w:r>
-        <w:t xml:space="preserve"> </w:t>
-      </w:r>
-      <w:r>
-        <w:t xml:space="preserve">A carga é grande (perto de 150 mil internações por ano), crescente e invisível: o sistema de informação em saúde vê o trabalho em uma internação a cada 15.576, e a Previdência, em uma a duas por mil. A população exposta cresceu e se precarizou, enquanto o setor tornou-se lucrativo. Esses fatos não dependem de identificação causal e sustentam, por si, a política mais barata da lista: tornar obrigatório o registro do nexo</w:t>
-      </w:r>
-      <w:r>
-        <w:t xml:space="preserve"> </w:t>
-      </w:r>
-      <w:r>
-        <w:t xml:space="preserve">“</w:t>
-      </w:r>
-      <w:r>
-        <w:t xml:space="preserve">trabalho por plataforma</w:t>
-      </w:r>
-      <w:r>
-        <w:t xml:space="preserve">”</w:t>
-      </w:r>
-      <w:r>
-        <w:t xml:space="preserve"> </w:t>
-      </w:r>
-      <w:r>
-        <w:t xml:space="preserve">na AIH e no SINAN.</w:t>
+        <w:t xml:space="preserve">Tabela 5 — Falso positivo da regra na janela do placebo (% de municípios com quebra em jan–jun/2016).</w:t>
+      </w:r>
+    </w:p>
+    <w:tbl>
+      <w:tblPr>
+        <w:tblStyle w:val="Table"/>
+        <w:tblW w:type="pct" w:w="5000"/>
+        <w:tblLook w:firstRow="1" w:lastRow="0" w:firstColumn="0" w:lastColumn="0" w:noHBand="0" w:noVBand="0" w:val="0020"/>
+        <w:jc w:val="start"/>
+      </w:tblPr>
+      <w:tblGrid>
+        <w:gridCol w:w="1584"/>
+        <w:gridCol w:w="1584"/>
+        <w:gridCol w:w="1584"/>
+        <w:gridCol w:w="1584"/>
+        <w:gridCol w:w="1584"/>
+      </w:tblGrid>
+      <w:tr>
+        <w:trPr>
+          <w:tblHeader w:val="true"/>
+        </w:trPr>
+        <w:tc>
+          <w:tcPr/>
+          <w:p>
+            <w:pPr>
+              <w:pStyle w:val="Compact"/>
+              <w:jc w:val="left"/>
+            </w:pPr>
+            <w:r>
+              <w:t xml:space="preserve">Faixa</w:t>
+            </w:r>
+          </w:p>
+        </w:tc>
+        <w:tc>
+          <w:tcPr/>
+          <w:p>
+            <w:pPr>
+              <w:pStyle w:val="Compact"/>
+              <w:jc w:val="left"/>
+            </w:pPr>
+            <w:r>
+              <w:t xml:space="preserve">Poisson puro</w:t>
+            </w:r>
+          </w:p>
+        </w:tc>
+        <w:tc>
+          <w:tcPr/>
+          <w:p>
+            <w:pPr>
+              <w:pStyle w:val="Compact"/>
+              <w:jc w:val="left"/>
+            </w:pPr>
+            <w:r>
+              <w:t xml:space="preserve">Superdispersão 0,5</w:t>
+            </w:r>
+          </w:p>
+        </w:tc>
+        <w:tc>
+          <w:tcPr/>
+          <w:p>
+            <w:pPr>
+              <w:pStyle w:val="Compact"/>
+              <w:jc w:val="left"/>
+            </w:pPr>
+            <w:r>
+              <w:t xml:space="preserve">Superdispersão 1,0</w:t>
+            </w:r>
+          </w:p>
+        </w:tc>
+        <w:tc>
+          <w:tcPr/>
+          <w:p>
+            <w:pPr>
+              <w:pStyle w:val="Compact"/>
+              <w:jc w:val="left"/>
+            </w:pPr>
+            <w:r>
+              <w:t xml:space="preserve">Observado</w:t>
+            </w:r>
+          </w:p>
+        </w:tc>
+      </w:tr>
+      <w:tr>
+        <w:tc>
+          <w:tcPr/>
+          <w:p>
+            <w:pPr>
+              <w:pStyle w:val="Compact"/>
+              <w:jc w:val="left"/>
+            </w:pPr>
+            <w:r>
+              <w:t xml:space="preserve">20–50 mil</w:t>
+            </w:r>
+          </w:p>
+        </w:tc>
+        <w:tc>
+          <w:tcPr/>
+          <w:p>
+            <w:pPr>
+              <w:pStyle w:val="Compact"/>
+              <w:jc w:val="left"/>
+            </w:pPr>
+            <w:r>
+              <w:t xml:space="preserve">0,3</w:t>
+            </w:r>
+          </w:p>
+        </w:tc>
+        <w:tc>
+          <w:tcPr/>
+          <w:p>
+            <w:pPr>
+              <w:pStyle w:val="Compact"/>
+              <w:jc w:val="left"/>
+            </w:pPr>
+            <w:r>
+              <w:t xml:space="preserve">0,5</w:t>
+            </w:r>
+          </w:p>
+        </w:tc>
+        <w:tc>
+          <w:tcPr/>
+          <w:p>
+            <w:pPr>
+              <w:pStyle w:val="Compact"/>
+              <w:jc w:val="left"/>
+            </w:pPr>
+            <w:r>
+              <w:t xml:space="preserve">0,6</w:t>
+            </w:r>
+          </w:p>
+        </w:tc>
+        <w:tc>
+          <w:tcPr/>
+          <w:p>
+            <w:pPr>
+              <w:pStyle w:val="Compact"/>
+              <w:jc w:val="left"/>
+            </w:pPr>
+            <w:r>
+              <w:t xml:space="preserve">0,7</w:t>
+            </w:r>
+          </w:p>
+        </w:tc>
+      </w:tr>
+      <w:tr>
+        <w:tc>
+          <w:tcPr/>
+          <w:p>
+            <w:pPr>
+              <w:pStyle w:val="Compact"/>
+              <w:jc w:val="left"/>
+            </w:pPr>
+            <w:r>
+              <w:t xml:space="preserve">50–100 mil</w:t>
+            </w:r>
+          </w:p>
+        </w:tc>
+        <w:tc>
+          <w:tcPr/>
+          <w:p>
+            <w:pPr>
+              <w:pStyle w:val="Compact"/>
+              <w:jc w:val="left"/>
+            </w:pPr>
+            <w:r>
+              <w:t xml:space="preserve">2,0</w:t>
+            </w:r>
+          </w:p>
+        </w:tc>
+        <w:tc>
+          <w:tcPr/>
+          <w:p>
+            <w:pPr>
+              <w:pStyle w:val="Compact"/>
+              <w:jc w:val="left"/>
+            </w:pPr>
+            <w:r>
+              <w:t xml:space="preserve">3,1</w:t>
+            </w:r>
+          </w:p>
+        </w:tc>
+        <w:tc>
+          <w:tcPr/>
+          <w:p>
+            <w:pPr>
+              <w:pStyle w:val="Compact"/>
+              <w:jc w:val="left"/>
+            </w:pPr>
+            <w:r>
+              <w:t xml:space="preserve">3,9</w:t>
+            </w:r>
+          </w:p>
+        </w:tc>
+        <w:tc>
+          <w:tcPr/>
+          <w:p>
+            <w:pPr>
+              <w:pStyle w:val="Compact"/>
+              <w:jc w:val="left"/>
+            </w:pPr>
+            <w:r>
+              <w:t xml:space="preserve">3,8</w:t>
+            </w:r>
+          </w:p>
+        </w:tc>
+      </w:tr>
+      <w:tr>
+        <w:tc>
+          <w:tcPr/>
+          <w:p>
+            <w:pPr>
+              <w:pStyle w:val="Compact"/>
+              <w:jc w:val="left"/>
+            </w:pPr>
+            <w:r>
+              <w:t xml:space="preserve">100–250 mil</w:t>
+            </w:r>
+          </w:p>
+        </w:tc>
+        <w:tc>
+          <w:tcPr/>
+          <w:p>
+            <w:pPr>
+              <w:pStyle w:val="Compact"/>
+              <w:jc w:val="left"/>
+            </w:pPr>
+            <w:r>
+              <w:t xml:space="preserve">4,2</w:t>
+            </w:r>
+          </w:p>
+        </w:tc>
+        <w:tc>
+          <w:tcPr/>
+          <w:p>
+            <w:pPr>
+              <w:pStyle w:val="Compact"/>
+              <w:jc w:val="left"/>
+            </w:pPr>
+            <w:r>
+              <w:t xml:space="preserve">8,6</w:t>
+            </w:r>
+          </w:p>
+        </w:tc>
+        <w:tc>
+          <w:tcPr/>
+          <w:p>
+            <w:pPr>
+              <w:pStyle w:val="Compact"/>
+              <w:jc w:val="left"/>
+            </w:pPr>
+            <w:r>
+              <w:t xml:space="preserve">12,0</w:t>
+            </w:r>
+          </w:p>
+        </w:tc>
+        <w:tc>
+          <w:tcPr/>
+          <w:p>
+            <w:pPr>
+              <w:pStyle w:val="Compact"/>
+              <w:jc w:val="left"/>
+            </w:pPr>
+            <w:r>
+              <w:t xml:space="preserve">24,1</w:t>
+            </w:r>
+          </w:p>
+        </w:tc>
+      </w:tr>
+      <w:tr>
+        <w:tc>
+          <w:tcPr/>
+          <w:p>
+            <w:pPr>
+              <w:pStyle w:val="Compact"/>
+              <w:jc w:val="left"/>
+            </w:pPr>
+            <w:r>
+              <w:t xml:space="preserve">250 mil+</w:t>
+            </w:r>
+          </w:p>
+        </w:tc>
+        <w:tc>
+          <w:tcPr/>
+          <w:p>
+            <w:pPr>
+              <w:pStyle w:val="Compact"/>
+              <w:jc w:val="left"/>
+            </w:pPr>
+            <w:r>
+              <w:t xml:space="preserve">2,1</w:t>
+            </w:r>
+          </w:p>
+        </w:tc>
+        <w:tc>
+          <w:tcPr/>
+          <w:p>
+            <w:pPr>
+              <w:pStyle w:val="Compact"/>
+              <w:jc w:val="left"/>
+            </w:pPr>
+            <w:r>
+              <w:t xml:space="preserve">9,4</w:t>
+            </w:r>
+          </w:p>
+        </w:tc>
+        <w:tc>
+          <w:tcPr/>
+          <w:p>
+            <w:pPr>
+              <w:pStyle w:val="Compact"/>
+              <w:jc w:val="left"/>
+            </w:pPr>
+            <w:r>
+              <w:t xml:space="preserve">16,8</w:t>
+            </w:r>
+          </w:p>
+        </w:tc>
+        <w:tc>
+          <w:tcPr/>
+          <w:p>
+            <w:pPr>
+              <w:pStyle w:val="Compact"/>
+              <w:jc w:val="left"/>
+            </w:pPr>
+            <w:r>
+              <w:t xml:space="preserve">25,9</w:t>
+            </w:r>
+          </w:p>
+        </w:tc>
+      </w:tr>
+    </w:tbl>
+    <w:p>
+      <w:pPr>
+        <w:pStyle w:val="BodyText"/>
+      </w:pPr>
+      <w:r>
+        <w:t xml:space="preserve">Abaixo de 100 mil habitantes, o falso positivo observado é exatamente o que ruído de contagem com superdispersão moderada produz (Tabela 5 e Figura 5, à esquerda): as quebras espúrias ali são acaso. Acima de 100 mil, o placebo observado é o dobro do que mesmo uma superdispersão forte gera — há acelerações locais reais nas aberturas antes de qualquer plataforma, que a regra não distingue da chegada do entregador. A simulação confirma, por um caminho independente, o corte de 100 mil que o desenho já adotava: a regra não serve para datar cidades grandes, e a coorte precoce não é escolha arbitrária.</w:t>
+      </w:r>
+    </w:p>
+    <w:p>
+      <w:pPr>
+        <w:pStyle w:val="CaptionedFigure"/>
+      </w:pPr>
+      <w:r>
+        <w:drawing>
+          <wp:inline>
+            <wp:extent cx="5334000" cy="2245894"/>
+            <wp:effectExtent b="0" l="0" r="0" t="0"/>
+            <wp:docPr descr="Simulação de Monte Carlo da regra de quebra. Esquerda: falso positivo na janela do placebo sob nulo de Poisson e gama-Poisson, contra o observado. Direita: proporção de saltos de r vezes na taxa de aberturas corretamente datados (de 5 meses antes a 12 meses depois do salto), por faixa." title="" id="45" name="Picture"/>
+            <a:graphic>
+              <a:graphicData uri="http://schemas.openxmlformats.org/drawingml/2006/picture">
+                <pic:pic>
+                  <pic:nvPicPr>
+                    <pic:cNvPr descr="figuras/fig5_simulacao_regra.png" id="46" name="Picture"/>
+                    <pic:cNvPicPr>
+                      <a:picLocks noChangeArrowheads="1" noChangeAspect="1"/>
+                    </pic:cNvPicPr>
+                  </pic:nvPicPr>
+                  <pic:blipFill>
+                    <a:blip r:embed="rId44"/>
+                    <a:stretch>
+                      <a:fillRect/>
+                    </a:stretch>
+                  </pic:blipFill>
+                  <pic:spPr bwMode="auto">
+                    <a:xfrm>
+                      <a:off x="0" y="0"/>
+                      <a:ext cx="5334000" cy="2245894"/>
+                    </a:xfrm>
+                    <a:prstGeom prst="rect">
+                      <a:avLst/>
+                    </a:prstGeom>
+                    <a:noFill/>
+                    <a:ln w="9525">
+                      <a:noFill/>
+                      <a:headEnd/>
+                      <a:tailEnd/>
+                    </a:ln>
+                  </pic:spPr>
+                </pic:pic>
+              </a:graphicData>
+            </a:graphic>
+          </wp:inline>
+        </w:drawing>
+      </w:r>
+    </w:p>
+    <w:p>
+      <w:pPr>
+        <w:pStyle w:val="ImageCaption"/>
+      </w:pPr>
+      <w:r>
+        <w:t xml:space="preserve">Simulação de Monte Carlo da regra de quebra. Esquerda: falso positivo na janela do placebo sob nulo de Poisson e gama-Poisson, contra o observado. Direita: proporção de saltos de</w:t>
+      </w:r>
+      <w:r>
+        <w:t xml:space="preserve"> </w:t>
+      </w:r>
+      <w:r>
+        <w:rPr>
+          <w:iCs/>
+          <w:i/>
+        </w:rPr>
+        <w:t xml:space="preserve">r</w:t>
+      </w:r>
+      <w:r>
+        <w:t xml:space="preserve"> </w:t>
+      </w:r>
+      <w:r>
+        <w:t xml:space="preserve">vezes na taxa de aberturas corretamente datados (de 5 meses antes a 12 meses depois do salto), por faixa.</w:t>
       </w:r>
     </w:p>
     <w:p>
@@ -4749,13 +5349,881 @@
           <w:bCs/>
           <w:b/>
         </w:rPr>
-        <w:t xml:space="preserve">O que ainda não se sabe — e por que esta versão não responde.</w:t>
-      </w:r>
-      <w:r>
-        <w:t xml:space="preserve"> </w:t>
-      </w:r>
-      <w:r>
-        <w:t xml:space="preserve">Quanto do crescimento das internações é</w:t>
+        <w:t xml:space="preserve">Tabela 6 — Poder da regra: % dos saltos corretamente datados.</w:t>
+      </w:r>
+    </w:p>
+    <w:tbl>
+      <w:tblPr>
+        <w:tblStyle w:val="Table"/>
+        <w:tblW w:type="auto" w:w="0"/>
+        <w:tblLook w:firstRow="1" w:lastRow="0" w:firstColumn="0" w:lastColumn="0" w:noHBand="0" w:noVBand="0" w:val="0020"/>
+        <w:jc w:val="start"/>
+      </w:tblPr>
+      <w:tblGrid>
+        <w:gridCol w:w="1320"/>
+        <w:gridCol w:w="1320"/>
+        <w:gridCol w:w="1320"/>
+        <w:gridCol w:w="1320"/>
+        <w:gridCol w:w="1320"/>
+        <w:gridCol w:w="1320"/>
+      </w:tblGrid>
+      <w:tr>
+        <w:trPr>
+          <w:tblHeader w:val="true"/>
+        </w:trPr>
+        <w:tc>
+          <w:tcPr/>
+          <w:p>
+            <w:pPr>
+              <w:pStyle w:val="Compact"/>
+              <w:jc w:val="left"/>
+            </w:pPr>
+            <w:r>
+              <w:t xml:space="preserve">Salto na taxa de aberturas</w:t>
+            </w:r>
+          </w:p>
+        </w:tc>
+        <w:tc>
+          <w:tcPr/>
+          <w:p>
+            <w:pPr>
+              <w:pStyle w:val="Compact"/>
+              <w:jc w:val="left"/>
+            </w:pPr>
+            <w:r>
+              <w:t xml:space="preserve">2×</w:t>
+            </w:r>
+          </w:p>
+        </w:tc>
+        <w:tc>
+          <w:tcPr/>
+          <w:p>
+            <w:pPr>
+              <w:pStyle w:val="Compact"/>
+              <w:jc w:val="left"/>
+            </w:pPr>
+            <w:r>
+              <w:t xml:space="preserve">3×</w:t>
+            </w:r>
+          </w:p>
+        </w:tc>
+        <w:tc>
+          <w:tcPr/>
+          <w:p>
+            <w:pPr>
+              <w:pStyle w:val="Compact"/>
+              <w:jc w:val="left"/>
+            </w:pPr>
+            <w:r>
+              <w:t xml:space="preserve">5×</w:t>
+            </w:r>
+          </w:p>
+        </w:tc>
+        <w:tc>
+          <w:tcPr/>
+          <w:p>
+            <w:pPr>
+              <w:pStyle w:val="Compact"/>
+              <w:jc w:val="left"/>
+            </w:pPr>
+            <w:r>
+              <w:t xml:space="preserve">10×</w:t>
+            </w:r>
+          </w:p>
+        </w:tc>
+        <w:tc>
+          <w:tcPr/>
+          <w:p>
+            <w:pPr>
+              <w:pStyle w:val="Compact"/>
+              <w:jc w:val="left"/>
+            </w:pPr>
+            <w:r>
+              <w:t xml:space="preserve">20×</w:t>
+            </w:r>
+          </w:p>
+        </w:tc>
+      </w:tr>
+      <w:tr>
+        <w:tc>
+          <w:tcPr/>
+          <w:p>
+            <w:pPr>
+              <w:pStyle w:val="Compact"/>
+              <w:jc w:val="left"/>
+            </w:pPr>
+            <w:r>
+              <w:t xml:space="preserve">20–50 mil</w:t>
+            </w:r>
+          </w:p>
+        </w:tc>
+        <w:tc>
+          <w:tcPr/>
+          <w:p>
+            <w:pPr>
+              <w:pStyle w:val="Compact"/>
+              <w:jc w:val="left"/>
+            </w:pPr>
+            <w:r>
+              <w:t xml:space="preserve">4,5</w:t>
+            </w:r>
+          </w:p>
+        </w:tc>
+        <w:tc>
+          <w:tcPr/>
+          <w:p>
+            <w:pPr>
+              <w:pStyle w:val="Compact"/>
+              <w:jc w:val="left"/>
+            </w:pPr>
+            <w:r>
+              <w:t xml:space="preserve">9,9</w:t>
+            </w:r>
+          </w:p>
+        </w:tc>
+        <w:tc>
+          <w:tcPr/>
+          <w:p>
+            <w:pPr>
+              <w:pStyle w:val="Compact"/>
+              <w:jc w:val="left"/>
+            </w:pPr>
+            <w:r>
+              <w:t xml:space="preserve">19,7</w:t>
+            </w:r>
+          </w:p>
+        </w:tc>
+        <w:tc>
+          <w:tcPr/>
+          <w:p>
+            <w:pPr>
+              <w:pStyle w:val="Compact"/>
+              <w:jc w:val="left"/>
+            </w:pPr>
+            <w:r>
+              <w:t xml:space="preserve">37,3</w:t>
+            </w:r>
+          </w:p>
+        </w:tc>
+        <w:tc>
+          <w:tcPr/>
+          <w:p>
+            <w:pPr>
+              <w:pStyle w:val="Compact"/>
+              <w:jc w:val="left"/>
+            </w:pPr>
+            <w:r>
+              <w:t xml:space="preserve">67,5</w:t>
+            </w:r>
+          </w:p>
+        </w:tc>
+      </w:tr>
+      <w:tr>
+        <w:tc>
+          <w:tcPr/>
+          <w:p>
+            <w:pPr>
+              <w:pStyle w:val="Compact"/>
+              <w:jc w:val="left"/>
+            </w:pPr>
+            <w:r>
+              <w:t xml:space="preserve">50–100 mil</w:t>
+            </w:r>
+          </w:p>
+        </w:tc>
+        <w:tc>
+          <w:tcPr/>
+          <w:p>
+            <w:pPr>
+              <w:pStyle w:val="Compact"/>
+              <w:jc w:val="left"/>
+            </w:pPr>
+            <w:r>
+              <w:t xml:space="preserve">21,7</w:t>
+            </w:r>
+          </w:p>
+        </w:tc>
+        <w:tc>
+          <w:tcPr/>
+          <w:p>
+            <w:pPr>
+              <w:pStyle w:val="Compact"/>
+              <w:jc w:val="left"/>
+            </w:pPr>
+            <w:r>
+              <w:t xml:space="preserve">37,5</w:t>
+            </w:r>
+          </w:p>
+        </w:tc>
+        <w:tc>
+          <w:tcPr/>
+          <w:p>
+            <w:pPr>
+              <w:pStyle w:val="Compact"/>
+              <w:jc w:val="left"/>
+            </w:pPr>
+            <w:r>
+              <w:t xml:space="preserve">53,4</w:t>
+            </w:r>
+          </w:p>
+        </w:tc>
+        <w:tc>
+          <w:tcPr/>
+          <w:p>
+            <w:pPr>
+              <w:pStyle w:val="Compact"/>
+              <w:jc w:val="left"/>
+            </w:pPr>
+            <w:r>
+              <w:t xml:space="preserve">68,8</w:t>
+            </w:r>
+          </w:p>
+        </w:tc>
+        <w:tc>
+          <w:tcPr/>
+          <w:p>
+            <w:pPr>
+              <w:pStyle w:val="Compact"/>
+              <w:jc w:val="left"/>
+            </w:pPr>
+            <w:r>
+              <w:t xml:space="preserve">83,6</w:t>
+            </w:r>
+          </w:p>
+        </w:tc>
+      </w:tr>
+    </w:tbl>
+    <w:p>
+      <w:pPr>
+        <w:pStyle w:val="BodyText"/>
+      </w:pPr>
+      <w:r>
+        <w:t xml:space="preserve">A regra é</w:t>
+      </w:r>
+      <w:r>
+        <w:t xml:space="preserve"> </w:t>
+      </w:r>
+      <w:r>
+        <w:rPr>
+          <w:bCs/>
+          <w:b/>
+        </w:rPr>
+        <w:t xml:space="preserve">conservadora</w:t>
+      </w:r>
+      <w:r>
+        <w:t xml:space="preserve"> </w:t>
+      </w:r>
+      <w:r>
+        <w:t xml:space="preserve">(Tabela 6 e Figura 5, à direita). Como exige ao menos 5 aberturas em 6 meses, num município de 20–50 mil — mediana de zero abertura por mês em 2015–2016 — só saltos de 10 vezes ou mais são datados com frequência. Quando data, data bem: o atraso mediano é de 0 a 2 meses, e a quebra espúria anterior ao salto ocorre em 1% (20–50 mil) e 5% (50–100 mil) das séries. A consequência direta é que parte dos 751</w:t>
+      </w:r>
+      <w:r>
+        <w:t xml:space="preserve"> </w:t>
+      </w:r>
+      <w:r>
+        <w:rPr>
+          <w:rStyle w:val="VerbatimChar"/>
+        </w:rPr>
+        <w:t xml:space="preserve">sem_quebra</w:t>
+      </w:r>
+      <w:r>
+        <w:t xml:space="preserve"> </w:t>
+      </w:r>
+      <w:r>
+        <w:t xml:space="preserve">recebeu plataforma, mas com poucos entregadores formalizados para a regra ver. Isso atenua o efeito estimado e dá peso empírico à robustez pré-registrada que exclui os</w:t>
+      </w:r>
+      <w:r>
+        <w:t xml:space="preserve"> </w:t>
+      </w:r>
+      <w:r>
+        <w:rPr>
+          <w:rStyle w:val="VerbatimChar"/>
+        </w:rPr>
+        <w:t xml:space="preserve">sem_quebra</w:t>
+      </w:r>
+      <w:r>
+        <w:t xml:space="preserve"> </w:t>
+      </w:r>
+      <w:r>
+        <w:t xml:space="preserve">do grupo de comparação.</w:t>
+      </w:r>
+    </w:p>
+    <w:bookmarkEnd w:id="47"/>
+    <w:bookmarkStart w:id="51" w:name="Xf1cfce79b642304067e12cc1204dd68e475de48"/>
+    <w:p>
+      <w:pPr>
+        <w:pStyle w:val="Heading2"/>
+      </w:pPr>
+      <w:r>
+        <w:t xml:space="preserve">3.6 Quem recebe data: o desbalanço regional não é porte nem formalização prévia</w:t>
+      </w:r>
+    </w:p>
+    <w:p>
+      <w:pPr>
+        <w:pStyle w:val="FirstParagraph"/>
+      </w:pPr>
+      <w:r>
+        <w:rPr>
+          <w:bCs/>
+          <w:b/>
+        </w:rPr>
+        <w:t xml:space="preserve">Tabela 7 — Regressão logística de P(</w:t>
+      </w:r>
+      <w:r>
+        <w:rPr>
+          <w:rStyle w:val="VerbatimChar"/>
+          <w:bCs/>
+          <w:b/>
+        </w:rPr>
+        <w:t xml:space="preserve">datado</w:t>
+      </w:r>
+      <w:r>
+        <w:rPr>
+          <w:bCs/>
+          <w:b/>
+        </w:rPr>
+        <w:t xml:space="preserve">) entre os 1.391 municípios de 20–100 mil: razões de chance (IC 95%, erros agrupados por UF) e ajuste.</w:t>
+      </w:r>
+    </w:p>
+    <w:tbl>
+      <w:tblPr>
+        <w:tblStyle w:val="Table"/>
+        <w:tblW w:type="pct" w:w="5000"/>
+        <w:tblLook w:firstRow="1" w:lastRow="0" w:firstColumn="0" w:lastColumn="0" w:noHBand="0" w:noVBand="0" w:val="0020"/>
+        <w:jc w:val="start"/>
+      </w:tblPr>
+      <w:tblGrid>
+        <w:gridCol w:w="1980"/>
+        <w:gridCol w:w="1980"/>
+        <w:gridCol w:w="1980"/>
+        <w:gridCol w:w="1980"/>
+      </w:tblGrid>
+      <w:tr>
+        <w:trPr>
+          <w:tblHeader w:val="true"/>
+        </w:trPr>
+        <w:tc>
+          <w:tcPr/>
+          <w:p>
+            <w:pPr>
+              <w:pStyle w:val="Compact"/>
+            </w:pPr>
+          </w:p>
+        </w:tc>
+        <w:tc>
+          <w:tcPr/>
+          <w:p>
+            <w:pPr>
+              <w:pStyle w:val="Compact"/>
+              <w:jc w:val="left"/>
+            </w:pPr>
+            <w:r>
+              <w:t xml:space="preserve">M1</w:t>
+            </w:r>
+          </w:p>
+        </w:tc>
+        <w:tc>
+          <w:tcPr/>
+          <w:p>
+            <w:pPr>
+              <w:pStyle w:val="Compact"/>
+              <w:jc w:val="left"/>
+            </w:pPr>
+            <w:r>
+              <w:t xml:space="preserve">M2</w:t>
+            </w:r>
+          </w:p>
+        </w:tc>
+        <w:tc>
+          <w:tcPr/>
+          <w:p>
+            <w:pPr>
+              <w:pStyle w:val="Compact"/>
+              <w:jc w:val="left"/>
+            </w:pPr>
+            <w:r>
+              <w:t xml:space="preserve">M3</w:t>
+            </w:r>
+          </w:p>
+        </w:tc>
+      </w:tr>
+      <w:tr>
+        <w:tc>
+          <w:tcPr/>
+          <w:p>
+            <w:pPr>
+              <w:pStyle w:val="Compact"/>
+              <w:jc w:val="left"/>
+            </w:pPr>
+            <w:r>
+              <w:t xml:space="preserve">log(população)</w:t>
+            </w:r>
+          </w:p>
+        </w:tc>
+        <w:tc>
+          <w:tcPr/>
+          <w:p>
+            <w:pPr>
+              <w:pStyle w:val="Compact"/>
+              <w:jc w:val="left"/>
+            </w:pPr>
+            <w:r>
+              <w:t xml:space="preserve">11,8 (7,8–17,7)</w:t>
+            </w:r>
+          </w:p>
+        </w:tc>
+        <w:tc>
+          <w:tcPr/>
+          <w:p>
+            <w:pPr>
+              <w:pStyle w:val="Compact"/>
+              <w:jc w:val="left"/>
+            </w:pPr>
+            <w:r>
+              <w:t xml:space="preserve">44,9 (27,0–74,7)</w:t>
+            </w:r>
+          </w:p>
+        </w:tc>
+        <w:tc>
+          <w:tcPr/>
+          <w:p>
+            <w:pPr>
+              <w:pStyle w:val="Compact"/>
+              <w:jc w:val="left"/>
+            </w:pPr>
+            <w:r>
+              <w:t xml:space="preserve">25,9 (14,7–45,7)</w:t>
+            </w:r>
+          </w:p>
+        </w:tc>
+      </w:tr>
+      <w:tr>
+        <w:tc>
+          <w:tcPr/>
+          <w:p>
+            <w:pPr>
+              <w:pStyle w:val="Compact"/>
+              <w:jc w:val="left"/>
+            </w:pPr>
+            <w:r>
+              <w:t xml:space="preserve">Sul</w:t>
+            </w:r>
+          </w:p>
+        </w:tc>
+        <w:tc>
+          <w:tcPr/>
+          <w:p>
+            <w:pPr>
+              <w:pStyle w:val="Compact"/>
+            </w:pPr>
+          </w:p>
+        </w:tc>
+        <w:tc>
+          <w:tcPr/>
+          <w:p>
+            <w:pPr>
+              <w:pStyle w:val="Compact"/>
+              <w:jc w:val="left"/>
+            </w:pPr>
+            <w:r>
+              <w:t xml:space="preserve">1,33 (0,80–2,19)</w:t>
+            </w:r>
+          </w:p>
+        </w:tc>
+        <w:tc>
+          <w:tcPr/>
+          <w:p>
+            <w:pPr>
+              <w:pStyle w:val="Compact"/>
+              <w:jc w:val="left"/>
+            </w:pPr>
+            <w:r>
+              <w:t xml:space="preserve">1,11 (0,68–1,82)</w:t>
+            </w:r>
+          </w:p>
+        </w:tc>
+      </w:tr>
+      <w:tr>
+        <w:tc>
+          <w:tcPr/>
+          <w:p>
+            <w:pPr>
+              <w:pStyle w:val="Compact"/>
+              <w:jc w:val="left"/>
+            </w:pPr>
+            <w:r>
+              <w:t xml:space="preserve">Centro-Oeste</w:t>
+            </w:r>
+          </w:p>
+        </w:tc>
+        <w:tc>
+          <w:tcPr/>
+          <w:p>
+            <w:pPr>
+              <w:pStyle w:val="Compact"/>
+            </w:pPr>
+          </w:p>
+        </w:tc>
+        <w:tc>
+          <w:tcPr/>
+          <w:p>
+            <w:pPr>
+              <w:pStyle w:val="Compact"/>
+              <w:jc w:val="left"/>
+            </w:pPr>
+            <w:r>
+              <w:t xml:space="preserve">0,39 (0,26–0,58)</w:t>
+            </w:r>
+          </w:p>
+        </w:tc>
+        <w:tc>
+          <w:tcPr/>
+          <w:p>
+            <w:pPr>
+              <w:pStyle w:val="Compact"/>
+              <w:jc w:val="left"/>
+            </w:pPr>
+            <w:r>
+              <w:t xml:space="preserve">0,56 (0,34–0,94)</w:t>
+            </w:r>
+          </w:p>
+        </w:tc>
+      </w:tr>
+      <w:tr>
+        <w:tc>
+          <w:tcPr/>
+          <w:p>
+            <w:pPr>
+              <w:pStyle w:val="Compact"/>
+              <w:jc w:val="left"/>
+            </w:pPr>
+            <w:r>
+              <w:t xml:space="preserve">Nordeste</w:t>
+            </w:r>
+          </w:p>
+        </w:tc>
+        <w:tc>
+          <w:tcPr/>
+          <w:p>
+            <w:pPr>
+              <w:pStyle w:val="Compact"/>
+            </w:pPr>
+          </w:p>
+        </w:tc>
+        <w:tc>
+          <w:tcPr/>
+          <w:p>
+            <w:pPr>
+              <w:pStyle w:val="Compact"/>
+              <w:jc w:val="left"/>
+            </w:pPr>
+            <w:r>
+              <w:t xml:space="preserve">0,036 (0,019–0,069)</w:t>
+            </w:r>
+          </w:p>
+        </w:tc>
+        <w:tc>
+          <w:tcPr/>
+          <w:p>
+            <w:pPr>
+              <w:pStyle w:val="Compact"/>
+              <w:jc w:val="left"/>
+            </w:pPr>
+            <w:r>
+              <w:t xml:space="preserve">0,058 (0,028–0,117)</w:t>
+            </w:r>
+          </w:p>
+        </w:tc>
+      </w:tr>
+      <w:tr>
+        <w:tc>
+          <w:tcPr/>
+          <w:p>
+            <w:pPr>
+              <w:pStyle w:val="Compact"/>
+              <w:jc w:val="left"/>
+            </w:pPr>
+            <w:r>
+              <w:t xml:space="preserve">Norte</w:t>
+            </w:r>
+          </w:p>
+        </w:tc>
+        <w:tc>
+          <w:tcPr/>
+          <w:p>
+            <w:pPr>
+              <w:pStyle w:val="Compact"/>
+            </w:pPr>
+          </w:p>
+        </w:tc>
+        <w:tc>
+          <w:tcPr/>
+          <w:p>
+            <w:pPr>
+              <w:pStyle w:val="Compact"/>
+              <w:jc w:val="left"/>
+            </w:pPr>
+            <w:r>
+              <w:t xml:space="preserve">0,017 (0,005–0,062)</w:t>
+            </w:r>
+          </w:p>
+        </w:tc>
+        <w:tc>
+          <w:tcPr/>
+          <w:p>
+            <w:pPr>
+              <w:pStyle w:val="Compact"/>
+              <w:jc w:val="left"/>
+            </w:pPr>
+            <w:r>
+              <w:t xml:space="preserve">0,029 (0,008–0,101)</w:t>
+            </w:r>
+          </w:p>
+        </w:tc>
+      </w:tr>
+      <w:tr>
+        <w:tc>
+          <w:tcPr/>
+          <w:p>
+            <w:pPr>
+              <w:pStyle w:val="Compact"/>
+              <w:jc w:val="left"/>
+            </w:pPr>
+            <w:r>
+              <w:t xml:space="preserve">log(aberturas/ano 2015–16)</w:t>
+            </w:r>
+          </w:p>
+        </w:tc>
+        <w:tc>
+          <w:tcPr/>
+          <w:p>
+            <w:pPr>
+              <w:pStyle w:val="Compact"/>
+            </w:pPr>
+          </w:p>
+        </w:tc>
+        <w:tc>
+          <w:tcPr/>
+          <w:p>
+            <w:pPr>
+              <w:pStyle w:val="Compact"/>
+            </w:pPr>
+          </w:p>
+        </w:tc>
+        <w:tc>
+          <w:tcPr/>
+          <w:p>
+            <w:pPr>
+              <w:pStyle w:val="Compact"/>
+              <w:jc w:val="left"/>
+            </w:pPr>
+            <w:r>
+              <w:t xml:space="preserve">1,92 (1,58–2,33)</w:t>
+            </w:r>
+          </w:p>
+        </w:tc>
+      </w:tr>
+      <w:tr>
+        <w:tc>
+          <w:tcPr/>
+          <w:p>
+            <w:pPr>
+              <w:pStyle w:val="Compact"/>
+              <w:jc w:val="left"/>
+            </w:pPr>
+            <w:r>
+              <w:t xml:space="preserve">AUC (validação cruzada 5×10)</w:t>
+            </w:r>
+          </w:p>
+        </w:tc>
+        <w:tc>
+          <w:tcPr/>
+          <w:p>
+            <w:pPr>
+              <w:pStyle w:val="Compact"/>
+              <w:jc w:val="left"/>
+            </w:pPr>
+            <w:r>
+              <w:t xml:space="preserve">0,755 ± 0,021</w:t>
+            </w:r>
+          </w:p>
+        </w:tc>
+        <w:tc>
+          <w:tcPr/>
+          <w:p>
+            <w:pPr>
+              <w:pStyle w:val="Compact"/>
+              <w:jc w:val="left"/>
+            </w:pPr>
+            <w:r>
+              <w:t xml:space="preserve">0,904 ± 0,018</w:t>
+            </w:r>
+          </w:p>
+        </w:tc>
+        <w:tc>
+          <w:tcPr/>
+          <w:p>
+            <w:pPr>
+              <w:pStyle w:val="Compact"/>
+              <w:jc w:val="left"/>
+            </w:pPr>
+            <w:r>
+              <w:t xml:space="preserve">0,912 ± 0,017</w:t>
+            </w:r>
+          </w:p>
+        </w:tc>
+      </w:tr>
+      <w:tr>
+        <w:tc>
+          <w:tcPr/>
+          <w:p>
+            <w:pPr>
+              <w:pStyle w:val="Compact"/>
+              <w:jc w:val="left"/>
+            </w:pPr>
+            <w:r>
+              <w:t xml:space="preserve">Pseudo-R² de McFadden</w:t>
+            </w:r>
+          </w:p>
+        </w:tc>
+        <w:tc>
+          <w:tcPr/>
+          <w:p>
+            <w:pPr>
+              <w:pStyle w:val="Compact"/>
+              <w:jc w:val="left"/>
+            </w:pPr>
+            <w:r>
+              <w:t xml:space="preserve">0,16</w:t>
+            </w:r>
+          </w:p>
+        </w:tc>
+        <w:tc>
+          <w:tcPr/>
+          <w:p>
+            <w:pPr>
+              <w:pStyle w:val="Compact"/>
+              <w:jc w:val="left"/>
+            </w:pPr>
+            <w:r>
+              <w:t xml:space="preserve">0,44</w:t>
+            </w:r>
+          </w:p>
+        </w:tc>
+        <w:tc>
+          <w:tcPr/>
+          <w:p>
+            <w:pPr>
+              <w:pStyle w:val="Compact"/>
+              <w:jc w:val="left"/>
+            </w:pPr>
+            <w:r>
+              <w:t xml:space="preserve">0,46</w:t>
+            </w:r>
+          </w:p>
+        </w:tc>
+      </w:tr>
+    </w:tbl>
+    <w:p>
+      <w:pPr>
+        <w:pStyle w:val="BodyText"/>
+      </w:pPr>
+      <w:r>
+        <w:t xml:space="preserve">A população sozinha discrimina razoavelmente (AUC 0,76); acrescentar a região leva a AUC a 0,90, e a propensão pré-plataforma acrescenta quase nada (0,91). Controlando porte e propensão prévia a formalizar entregadores, um município nordestino tem chance</w:t>
+      </w:r>
+      <w:r>
+        <w:t xml:space="preserve"> </w:t>
+      </w:r>
+      <w:r>
+        <w:rPr>
+          <w:bCs/>
+          <w:b/>
+        </w:rPr>
+        <w:t xml:space="preserve">17 vezes menor</w:t>
+      </w:r>
+      <w:r>
+        <w:t xml:space="preserve"> </w:t>
+      </w:r>
+      <w:r>
+        <w:t xml:space="preserve">de receber data que um do Sudeste de mesmo porte, e um do Norte,</w:t>
+      </w:r>
+      <w:r>
+        <w:t xml:space="preserve"> </w:t>
+      </w:r>
+      <w:r>
+        <w:rPr>
+          <w:bCs/>
+          <w:b/>
+        </w:rPr>
+        <w:t xml:space="preserve">34 vezes menor</w:t>
+      </w:r>
+      <w:r>
+        <w:t xml:space="preserve"> </w:t>
+      </w:r>
+      <w:r>
+        <w:t xml:space="preserve">(Figura 6). A propensão prévia é relevante (quase o dobro da chance por unidade de log) mas absorve pouco do efeito regional: as razões de chance de Nordeste e Norte sobem só de 0,036 para 0,058 e de 0,017 para 0,029.</w:t>
+      </w:r>
+    </w:p>
+    <w:p>
+      <w:pPr>
+        <w:pStyle w:val="CaptionedFigure"/>
+      </w:pPr>
+      <w:r>
+        <w:drawing>
+          <wp:inline>
+            <wp:extent cx="5067300" cy="2423491"/>
+            <wp:effectExtent b="0" l="0" r="0" t="0"/>
+            <wp:docPr descr="Razões de chance de receber data, por região (referência: Sudeste), antes (M2) e depois (M3) de controlar a propensão pré-plataforma a abrir MEI de entrega. Escala logarítmica; IC 95% com erros agrupados por UF." title="" id="49" name="Picture"/>
+            <a:graphic>
+              <a:graphicData uri="http://schemas.openxmlformats.org/drawingml/2006/picture">
+                <pic:pic>
+                  <pic:nvPicPr>
+                    <pic:cNvPr descr="figuras/fig6_selecao.png" id="50" name="Picture"/>
+                    <pic:cNvPicPr>
+                      <a:picLocks noChangeArrowheads="1" noChangeAspect="1"/>
+                    </pic:cNvPicPr>
+                  </pic:nvPicPr>
+                  <pic:blipFill>
+                    <a:blip r:embed="rId48"/>
+                    <a:stretch>
+                      <a:fillRect/>
+                    </a:stretch>
+                  </pic:blipFill>
+                  <pic:spPr bwMode="auto">
+                    <a:xfrm>
+                      <a:off x="0" y="0"/>
+                      <a:ext cx="5067300" cy="2423491"/>
+                    </a:xfrm>
+                    <a:prstGeom prst="rect">
+                      <a:avLst/>
+                    </a:prstGeom>
+                    <a:noFill/>
+                    <a:ln w="9525">
+                      <a:noFill/>
+                      <a:headEnd/>
+                      <a:tailEnd/>
+                    </a:ln>
+                  </pic:spPr>
+                </pic:pic>
+              </a:graphicData>
+            </a:graphic>
+          </wp:inline>
+        </w:drawing>
+      </w:r>
+    </w:p>
+    <w:p>
+      <w:pPr>
+        <w:pStyle w:val="ImageCaption"/>
+      </w:pPr>
+      <w:r>
+        <w:t xml:space="preserve">Razões de chance de receber data, por região (referência: Sudeste), antes (M2) e depois (M3) de controlar a propensão pré-plataforma a abrir MEI de entrega. Escala logarítmica; IC 95% com erros agrupados por UF.</w:t>
+      </w:r>
+    </w:p>
+    <w:p>
+      <w:pPr>
+        <w:pStyle w:val="BodyText"/>
+      </w:pPr>
+      <w:r>
+        <w:t xml:space="preserve">Duas leituras são compatíveis com isso, e o dado do CNPJ não separa uma da outra: as plataformas chegaram mais tarde (ou não chegaram) às cidades médias do Nordeste e do Norte, ou chegaram, mas a formalização dos entregadores</w:t>
       </w:r>
       <w:r>
         <w:t xml:space="preserve"> </w:t>
@@ -4765,77 +6233,94 @@
           <w:iCs/>
           <w:i/>
         </w:rPr>
-        <w:t xml:space="preserve">causado</w:t>
-      </w:r>
-      <w:r>
-        <w:t xml:space="preserve"> </w:t>
-      </w:r>
-      <w:r>
-        <w:t xml:space="preserve">pela chegada do entregador por corrida. Essa fração é o que converte</w:t>
-      </w:r>
-      <w:r>
-        <w:t xml:space="preserve"> </w:t>
-      </w:r>
-      <w:r>
-        <w:t xml:space="preserve">“</w:t>
-      </w:r>
-      <w:r>
-        <w:t xml:space="preserve">o SUS paga por acidentes de moto</w:t>
-      </w:r>
-      <w:r>
-        <w:t xml:space="preserve">”</w:t>
-      </w:r>
-      <w:r>
-        <w:t xml:space="preserve"> </w:t>
-      </w:r>
-      <w:r>
-        <w:t xml:space="preserve">em</w:t>
-      </w:r>
-      <w:r>
-        <w:t xml:space="preserve"> </w:t>
-      </w:r>
-      <w:r>
-        <w:t xml:space="preserve">“</w:t>
-      </w:r>
-      <w:r>
-        <w:t xml:space="preserve">o SUS paga por acidentes que a remuneração por corrida causou</w:t>
-      </w:r>
-      <w:r>
-        <w:t xml:space="preserve">”</w:t>
-      </w:r>
-      <w:r>
-        <w:t xml:space="preserve">. Optamos por não estimá-la antes do depósito do plano no OSF: o número de escolhas defensáveis (agregação dos efeitos dinâmicos, grupo de comparação, nível de cluster, janela, desfecho em taxa ou contagem) é grande o bastante para que qualquer resultado obtido antes do registro fosse suspeito de busca por especificação. O estimando, o critério de inferência e as consequências de cada teste de falha estão fixados.</w:t>
-      </w:r>
-    </w:p>
-    <w:p>
-      <w:pPr>
-        <w:pStyle w:val="BodyText"/>
+        <w:t xml:space="preserve">depois</w:t>
+      </w:r>
+      <w:r>
+        <w:t xml:space="preserve"> </w:t>
+      </w:r>
+      <w:r>
+        <w:t xml:space="preserve">da chegada é regionalmente diferente — o que a simulação da seção 3.5 diz que a regra não veria. Em qualquer das duas, o grupo de comparação</w:t>
+      </w:r>
+      <w:r>
+        <w:t xml:space="preserve"> </w:t>
+      </w:r>
+      <w:r>
+        <w:rPr>
+          <w:iCs/>
+          <w:i/>
+        </w:rPr>
+        <w:t xml:space="preserve">not-yet-treated</w:t>
+      </w:r>
+      <w:r>
+        <w:t xml:space="preserve"> </w:t>
+      </w:r>
+      <w:r>
+        <w:t xml:space="preserve">mistura regiões com trajetórias distintas.</w:t>
+      </w:r>
+    </w:p>
+    <w:bookmarkEnd w:id="51"/>
+    <w:bookmarkEnd w:id="52"/>
+    <w:bookmarkStart w:id="53" w:name="discussão"/>
+    <w:p>
+      <w:pPr>
+        <w:pStyle w:val="Heading1"/>
+      </w:pPr>
+      <w:r>
+        <w:t xml:space="preserve">4. Discussão</w:t>
+      </w:r>
+    </w:p>
+    <w:p>
+      <w:pPr>
+        <w:pStyle w:val="FirstParagraph"/>
       </w:pPr>
       <w:r>
         <w:rPr>
           <w:bCs/>
           <w:b/>
         </w:rPr>
-        <w:t xml:space="preserve">Limitações já conhecidas, com a direção do viés.</w:t>
-      </w:r>
-      <w:r>
-        <w:t xml:space="preserve"> </w:t>
-      </w:r>
-      <w:r>
-        <w:t xml:space="preserve">Três razões fazem do coeficiente a ser estimado um</w:t>
-      </w:r>
-      <w:r>
-        <w:t xml:space="preserve"> </w:t>
-      </w:r>
+        <w:t xml:space="preserve">O que já se sabe.</w:t>
+      </w:r>
+      <w:r>
+        <w:t xml:space="preserve"> </w:t>
+      </w:r>
+      <w:r>
+        <w:t xml:space="preserve">A carga é grande (perto de 150 mil internações por ano), crescente e invisível: o sistema de informação em saúde vê o trabalho em uma internação a cada 15.576, e a Previdência, em uma a duas por mil. A população exposta cresceu e se precarizou, enquanto o setor tornou-se lucrativo. Esses fatos não dependem de identificação causal e sustentam, por si, a política mais barata da lista: tornar obrigatório o registro do nexo</w:t>
+      </w:r>
+      <w:r>
+        <w:t xml:space="preserve"> </w:t>
+      </w:r>
+      <w:r>
+        <w:t xml:space="preserve">“</w:t>
+      </w:r>
+      <w:r>
+        <w:t xml:space="preserve">trabalho por plataforma</w:t>
+      </w:r>
+      <w:r>
+        <w:t xml:space="preserve">”</w:t>
+      </w:r>
+      <w:r>
+        <w:t xml:space="preserve"> </w:t>
+      </w:r>
+      <w:r>
+        <w:t xml:space="preserve">na AIH e no SINAN.</w:t>
+      </w:r>
+    </w:p>
+    <w:p>
+      <w:pPr>
+        <w:pStyle w:val="BodyText"/>
+      </w:pPr>
       <w:r>
         <w:rPr>
           <w:bCs/>
           <w:b/>
         </w:rPr>
-        <w:t xml:space="preserve">piso</w:t>
-      </w:r>
-      <w:r>
-        <w:t xml:space="preserve">, e são distintas: (1)</w:t>
+        <w:t xml:space="preserve">O que ainda não se sabe — e por que esta versão não responde.</w:t>
+      </w:r>
+      <w:r>
+        <w:t xml:space="preserve"> </w:t>
+      </w:r>
+      <w:r>
+        <w:t xml:space="preserve">Quanto do crescimento das internações é</w:t>
       </w:r>
       <w:r>
         <w:t xml:space="preserve"> </w:t>
@@ -4845,13 +6330,77 @@
           <w:iCs/>
           <w:i/>
         </w:rPr>
-        <w:t xml:space="preserve">diluição</w:t>
-      </w:r>
-      <w:r>
-        <w:t xml:space="preserve"> </w:t>
-      </w:r>
-      <w:r>
-        <w:t xml:space="preserve">— o desfecho inclui todos os motociclistas, não só entregadores (desenho ecológico); (2)</w:t>
+        <w:t xml:space="preserve">causado</w:t>
+      </w:r>
+      <w:r>
+        <w:t xml:space="preserve"> </w:t>
+      </w:r>
+      <w:r>
+        <w:t xml:space="preserve">pela chegada do entregador por corrida. Essa fração é o que converte</w:t>
+      </w:r>
+      <w:r>
+        <w:t xml:space="preserve"> </w:t>
+      </w:r>
+      <w:r>
+        <w:t xml:space="preserve">“</w:t>
+      </w:r>
+      <w:r>
+        <w:t xml:space="preserve">o SUS paga por acidentes de moto</w:t>
+      </w:r>
+      <w:r>
+        <w:t xml:space="preserve">”</w:t>
+      </w:r>
+      <w:r>
+        <w:t xml:space="preserve"> </w:t>
+      </w:r>
+      <w:r>
+        <w:t xml:space="preserve">em</w:t>
+      </w:r>
+      <w:r>
+        <w:t xml:space="preserve"> </w:t>
+      </w:r>
+      <w:r>
+        <w:t xml:space="preserve">“</w:t>
+      </w:r>
+      <w:r>
+        <w:t xml:space="preserve">o SUS paga por acidentes que a remuneração por corrida causou</w:t>
+      </w:r>
+      <w:r>
+        <w:t xml:space="preserve">”</w:t>
+      </w:r>
+      <w:r>
+        <w:t xml:space="preserve">. Optamos por não estimá-la antes do depósito do plano no OSF: o número de escolhas defensáveis (agregação dos efeitos dinâmicos, grupo de comparação, nível de cluster, janela, desfecho em taxa ou contagem) é grande o bastante para que qualquer resultado obtido antes do registro fosse suspeito de busca por especificação. O estimando, o critério de inferência e as consequências de cada teste de falha estão fixados.</w:t>
+      </w:r>
+    </w:p>
+    <w:p>
+      <w:pPr>
+        <w:pStyle w:val="BodyText"/>
+      </w:pPr>
+      <w:r>
+        <w:rPr>
+          <w:bCs/>
+          <w:b/>
+        </w:rPr>
+        <w:t xml:space="preserve">Limitações já conhecidas, com a direção do viés.</w:t>
+      </w:r>
+      <w:r>
+        <w:t xml:space="preserve"> </w:t>
+      </w:r>
+      <w:r>
+        <w:t xml:space="preserve">Três razões fazem do coeficiente a ser estimado um</w:t>
+      </w:r>
+      <w:r>
+        <w:t xml:space="preserve"> </w:t>
+      </w:r>
+      <w:r>
+        <w:rPr>
+          <w:bCs/>
+          <w:b/>
+        </w:rPr>
+        <w:t xml:space="preserve">piso</w:t>
+      </w:r>
+      <w:r>
+        <w:t xml:space="preserve">, e são distintas: (1)</w:t>
       </w:r>
       <w:r>
         <w:t xml:space="preserve"> </w:t>
@@ -4861,13 +6410,13 @@
           <w:iCs/>
           <w:i/>
         </w:rPr>
-        <w:t xml:space="preserve">contaminação do pré-período</w:t>
-      </w:r>
-      <w:r>
-        <w:t xml:space="preserve"> </w:t>
-      </w:r>
-      <w:r>
-        <w:t xml:space="preserve">— o</w:t>
+        <w:t xml:space="preserve">diluição</w:t>
+      </w:r>
+      <w:r>
+        <w:t xml:space="preserve"> </w:t>
+      </w:r>
+      <w:r>
+        <w:t xml:space="preserve">— o desfecho inclui todos os motociclistas, não só entregadores (desenho ecológico); (2)</w:t>
       </w:r>
       <w:r>
         <w:t xml:space="preserve"> </w:t>
@@ -4877,13 +6426,13 @@
           <w:iCs/>
           <w:i/>
         </w:rPr>
-        <w:t xml:space="preserve">marketplace</w:t>
-      </w:r>
-      <w:r>
-        <w:t xml:space="preserve"> </w:t>
-      </w:r>
-      <w:r>
-        <w:t xml:space="preserve">já operava antes da frota própria; (3)</w:t>
+        <w:t xml:space="preserve">contaminação do pré-período</w:t>
+      </w:r>
+      <w:r>
+        <w:t xml:space="preserve"> </w:t>
+      </w:r>
+      <w:r>
+        <w:t xml:space="preserve">— o</w:t>
       </w:r>
       <w:r>
         <w:t xml:space="preserve"> </w:t>
@@ -4893,6 +6442,22 @@
           <w:iCs/>
           <w:i/>
         </w:rPr>
+        <w:t xml:space="preserve">marketplace</w:t>
+      </w:r>
+      <w:r>
+        <w:t xml:space="preserve"> </w:t>
+      </w:r>
+      <w:r>
+        <w:t xml:space="preserve">já operava antes da frota própria; (3)</w:t>
+      </w:r>
+      <w:r>
+        <w:t xml:space="preserve"> </w:t>
+      </w:r>
+      <w:r>
+        <w:rPr>
+          <w:iCs/>
+          <w:i/>
+        </w:rPr>
         <w:t xml:space="preserve">denominador endógeno</w:t>
       </w:r>
       <w:r>
@@ -4927,7 +6492,7 @@
         <w:t xml:space="preserve"> </w:t>
       </w:r>
       <w:r>
-        <w:t xml:space="preserve">contém municípios tratados não detectados, o que contamina o grupo de comparação e atenua o efeito. A robustez pré-registrada que exclui os</w:t>
+        <w:t xml:space="preserve">contém municípios tratados não detectados, o que contamina o grupo de comparação e atenua o efeito. As seções 3.5 e 3.6 dão número a essa última ameaça, que tem duas faces: a simulação mostra que a regra perde a maioria das chegadas modestas em municípios pequenos, e o modelo de seleção mostra que quem fica sem data é, sobretudo, nordestino e nortista, independentemente de porte e de formalização prévia. A robustez pré-registrada que exclui os</w:t>
       </w:r>
       <w:r>
         <w:t xml:space="preserve"> </w:t>
@@ -4942,7 +6507,7 @@
         <w:t xml:space="preserve"> </w:t>
       </w:r>
       <w:r>
-        <w:t xml:space="preserve">responde diretamente a isso; uma análise por região, exploratória e declarada como tal, é o passo natural.</w:t>
+        <w:t xml:space="preserve">responde à primeira face; para a segunda, a análise propõe, como exploratória declarada, (i) o estimador com efeitos fixos de região × mês, comparando só municípios da mesma grande região, e (ii) a estimação restrita a Sul e Sudeste, onde 73–78% dos municípios têm data e o grupo de comparação é mais homogêneo.</w:t>
       </w:r>
     </w:p>
     <w:p>
@@ -4963,8 +6528,8 @@
         <w:t xml:space="preserve">O debate brasileiro é sobre vínculo; a externalidade fiscal não depende dele. Se H1 for sustentada, a fração atribuível dá a base de cálculo para uma contribuição acidentária das plataformas sobre o valor das corridas — equivalente funcional do RAT —, ou um repasse por corrida ao SUS no molde do que o DPVAT fazia. Se não for, a invisibilidade documentada aqui continua sendo, sozinha, argumento para mudar o registro.</w:t>
       </w:r>
     </w:p>
-    <w:bookmarkEnd w:id="44"/>
-    <w:bookmarkStart w:id="45" w:name="conclusão"/>
+    <w:bookmarkEnd w:id="53"/>
+    <w:bookmarkStart w:id="54" w:name="conclusão"/>
     <w:p>
       <w:pPr>
         <w:pStyle w:val="Heading1"/>
@@ -4978,11 +6543,26 @@
         <w:pStyle w:val="FirstParagraph"/>
       </w:pPr>
       <w:r>
-        <w:t xml:space="preserve">O trabalho responde ao primeiro objetivo — medir carga, custo e invisibilidade — com números reproduzíveis e validados contra referências externas: ~150 mil internações de motociclistas por ano no SUS, R$ 288 milhões pagos em 2025, uma em 15.576 com nexo ocupacional registrado, numa força de trabalho 85% informal, ao lado de uma plataforma líder com R$ 1,8 bilhão de resultado operacional. Responde ao segundo objetivo construindo, sem olhar o desfecho, um tratamento municipal datado para 640 municípios, com hiperparâmetros calibrados contra placebo e validação externa e com taxa de falso positivo baixa onde é usado. O terceiro objetivo está especificado e travado em pré-registro; a estimação causal e a auditoria cega do tratamento são as próximas etapas.</w:t>
-      </w:r>
-    </w:p>
-    <w:bookmarkEnd w:id="45"/>
-    <w:bookmarkStart w:id="46" w:name="materiais-complementares"/>
+        <w:t xml:space="preserve">O trabalho responde ao primeiro objetivo — medir carga, custo e invisibilidade — com números reproduzíveis e validados contra referências externas: ~150 mil internações de motociclistas por ano no SUS, R$ 288 milhões pagos em 2025, uma em 15.576 com nexo ocupacional registrado, numa força de trabalho 85% informal, ao lado de uma plataforma líder com R$ 1,8 bilhão de resultado operacional. Responde ao segundo objetivo construindo, sem olhar o desfecho, um tratamento municipal datado para 640 municípios, com hiperparâmetros calibrados contra placebo e validação externa e com taxa de falso positivo baixa onde é usado. Os modelos complementares acrescentam três conclusões sobre o próprio instrumento: (1) a regra está calibrada onde é usada — o falso positivo abaixo de 100 mil habitantes é o do ruído de contagem —, e a simulação confirma de forma independente que ela não data cidades grandes; (2) a regra é conservadora, e os</w:t>
+      </w:r>
+      <w:r>
+        <w:t xml:space="preserve"> </w:t>
+      </w:r>
+      <w:r>
+        <w:rPr>
+          <w:rStyle w:val="VerbatimChar"/>
+        </w:rPr>
+        <w:t xml:space="preserve">sem_quebra</w:t>
+      </w:r>
+      <w:r>
+        <w:t xml:space="preserve"> </w:t>
+      </w:r>
+      <w:r>
+        <w:t xml:space="preserve">contêm tratados não detectados, o que torna o efeito estimado um piso por mais uma razão; (3) a seleção ao tratamento é fortemente regional e não se explica por porte nem por formalização prévia, o que pede comparações dentro da região. O terceiro objetivo está especificado e travado em pré-registro; a estimação causal, com essas duas especificações regionais como exploratórias declaradas, e a auditoria cega do tratamento são as próximas etapas.</w:t>
+      </w:r>
+    </w:p>
+    <w:bookmarkEnd w:id="54"/>
+    <w:bookmarkStart w:id="55" w:name="materiais-complementares"/>
     <w:p>
       <w:pPr>
         <w:pStyle w:val="Heading1"/>
@@ -4995,7 +6575,7 @@
       <w:pPr>
         <w:numPr>
           <w:ilvl w:val="0"/>
-          <w:numId w:val="1002"/>
+          <w:numId w:val="1003"/>
         </w:numPr>
         <w:pStyle w:val="Compact"/>
       </w:pPr>
@@ -5046,7 +6626,7 @@
         <w:t xml:space="preserve"> </w:t>
       </w:r>
       <w:r>
-        <w:t xml:space="preserve">roda sem rede e sem dado. Log de 43 decisões datadas em</w:t>
+        <w:t xml:space="preserve">roda sem rede e sem dado. Log de 44 decisões datadas em</w:t>
       </w:r>
       <w:r>
         <w:t xml:space="preserve"> </w:t>
@@ -5077,7 +6657,7 @@
       <w:pPr>
         <w:numPr>
           <w:ilvl w:val="0"/>
-          <w:numId w:val="1002"/>
+          <w:numId w:val="1003"/>
         </w:numPr>
         <w:pStyle w:val="Compact"/>
       </w:pPr>
@@ -5108,7 +6688,7 @@
       <w:pPr>
         <w:numPr>
           <w:ilvl w:val="0"/>
-          <w:numId w:val="1002"/>
+          <w:numId w:val="1003"/>
         </w:numPr>
         <w:pStyle w:val="Compact"/>
       </w:pPr>
@@ -5117,7 +6697,7 @@
           <w:bCs/>
           <w:b/>
         </w:rPr>
-        <w:t xml:space="preserve">Script desta versão:</w:t>
+        <w:t xml:space="preserve">Scripts desta versão:</w:t>
       </w:r>
       <w:r>
         <w:t xml:space="preserve"> </w:t>
@@ -5132,7 +6712,7 @@
         <w:t xml:space="preserve"> </w:t>
       </w:r>
       <w:r>
-        <w:t xml:space="preserve">gera as Figuras 1–4 e as tabelas de</w:t>
+        <w:t xml:space="preserve">gera as Figuras 1–4, e</w:t>
       </w:r>
       <w:r>
         <w:t xml:space="preserve"> </w:t>
@@ -5141,20 +6721,32 @@
         <w:rPr>
           <w:rStyle w:val="VerbatimChar"/>
         </w:rPr>
+        <w:t xml:space="preserve">artigo/modelos_artigo.py</w:t>
+      </w:r>
+      <w:r>
+        <w:t xml:space="preserve"> </w:t>
+      </w:r>
+      <w:r>
+        <w:t xml:space="preserve">a simulação, o modelo de seleção e as Figuras 5–6 (≈ 25 s). Ambos leem só os arquivos versionados, sem rede, conferem o hash do tratamento e escrevem as tabelas em</w:t>
+      </w:r>
+      <w:r>
+        <w:t xml:space="preserve"> </w:t>
+      </w:r>
+      <w:r>
+        <w:rPr>
+          <w:rStyle w:val="VerbatimChar"/>
+        </w:rPr>
         <w:t xml:space="preserve">artigo/tabelas/</w:t>
       </w:r>
       <w:r>
-        <w:t xml:space="preserve"> </w:t>
-      </w:r>
-      <w:r>
-        <w:t xml:space="preserve">a partir só dos arquivos versionados, sem rede.</w:t>
+        <w:t xml:space="preserve">.</w:t>
       </w:r>
     </w:p>
     <w:p>
       <w:pPr>
         <w:numPr>
           <w:ilvl w:val="0"/>
-          <w:numId w:val="1002"/>
+          <w:numId w:val="1003"/>
         </w:numPr>
         <w:pStyle w:val="Compact"/>
       </w:pPr>
@@ -5169,7 +6761,7 @@
         <w:t xml:space="preserve"> </w:t>
       </w:r>
       <w:r>
-        <w:t xml:space="preserve">Python ≥ 3.11; pandas, numpy, pyarrow, PySUS ≥ 2.11, matplotlib, requests (versões em</w:t>
+        <w:t xml:space="preserve">Python ≥ 3.11; pandas, numpy, scipy, pyarrow, PySUS ≥ 2.11, matplotlib, requests (versões em</w:t>
       </w:r>
       <w:r>
         <w:t xml:space="preserve"> </w:t>
@@ -5181,14 +6773,14 @@
         <w:t xml:space="preserve">pyproject.toml</w:t>
       </w:r>
       <w:r>
-        <w:t xml:space="preserve">).</w:t>
+        <w:t xml:space="preserve">); para os modelos desta versão, statsmodels 0.14 e scikit-learn 1.x.</w:t>
       </w:r>
     </w:p>
     <w:p>
       <w:pPr>
         <w:numPr>
           <w:ilvl w:val="0"/>
-          <w:numId w:val="1002"/>
+          <w:numId w:val="1003"/>
         </w:numPr>
         <w:pStyle w:val="Compact"/>
       </w:pPr>
@@ -5280,14 +6872,29 @@
         <w:t xml:space="preserve">not-yet-treated</w:t>
       </w:r>
       <w:r>
-        <w:t xml:space="preserve">, cluster em região imediata, α = 0,05 bilateral. Semente da auditoria: 20261011.</w:t>
+        <w:t xml:space="preserve">, cluster em região imediata, α = 0,05 bilateral. Semente da auditoria: 20261011. Modelos complementares: semente 20261013; 200 réplicas por município no falso positivo e 50 no poder; superdispersão gama de variância relativa 0,25, 0,5 e 1,0; regressão logística sem penalização (statsmodels) para as razões de chance e</w:t>
+      </w:r>
+      <w:r>
+        <w:t xml:space="preserve"> </w:t>
+      </w:r>
+      <w:r>
+        <w:rPr>
+          <w:rStyle w:val="VerbatimChar"/>
+        </w:rPr>
+        <w:t xml:space="preserve">LogisticRegression</w:t>
+      </w:r>
+      <w:r>
+        <w:t xml:space="preserve"> </w:t>
+      </w:r>
+      <w:r>
+        <w:t xml:space="preserve">com regularização L2 padrão (scikit-learn, C = 1) para a AUC.</w:t>
       </w:r>
     </w:p>
     <w:p>
       <w:pPr>
         <w:numPr>
           <w:ilvl w:val="0"/>
-          <w:numId w:val="1002"/>
+          <w:numId w:val="1003"/>
         </w:numPr>
         <w:pStyle w:val="Compact"/>
       </w:pPr>
@@ -5334,7 +6941,7 @@
       <w:pPr>
         <w:numPr>
           <w:ilvl w:val="0"/>
-          <w:numId w:val="1002"/>
+          <w:numId w:val="1003"/>
         </w:numPr>
         <w:pStyle w:val="Compact"/>
       </w:pPr>
@@ -5361,8 +6968,8 @@
         <w:t xml:space="preserve">).</w:t>
       </w:r>
     </w:p>
-    <w:bookmarkEnd w:id="46"/>
-    <w:bookmarkStart w:id="47" w:name="declaração-de-uso-de-ia-generativa"/>
+    <w:bookmarkEnd w:id="55"/>
+    <w:bookmarkStart w:id="56" w:name="declaração-de-uso-de-ia-generativa"/>
     <w:p>
       <w:pPr>
         <w:pStyle w:val="Heading1"/>
@@ -5389,8 +6996,8 @@
         <w:t xml:space="preserve">[AJUSTAR CONFORME O USO EFETIVO DA EQUIPE]</w:t>
       </w:r>
     </w:p>
-    <w:bookmarkEnd w:id="47"/>
-    <w:bookmarkStart w:id="48" w:name="referências"/>
+    <w:bookmarkEnd w:id="56"/>
+    <w:bookmarkStart w:id="57" w:name="referências"/>
     <w:p>
       <w:pPr>
         <w:pStyle w:val="Heading1"/>
@@ -5629,7 +7236,7 @@
         <w:t xml:space="preserve">, v. 225, n. 2, p. 175–199, 2021.</w:t>
       </w:r>
     </w:p>
-    <w:bookmarkEnd w:id="48"/>
+    <w:bookmarkEnd w:id="57"/>
     <w:sectPr/>
   </w:body>
 </w:document>
@@ -5931,6 +7538,9 @@
     </w:lvlOverride>
   </w:num>
   <w:num w:numId="1002">
+    <w:abstractNumId w:val="991"/>
+  </w:num>
+  <w:num w:numId="1003">
     <w:abstractNumId w:val="991"/>
   </w:num>
 </w:numbering>

</xml_diff>

<commit_message>
Artigo: DOI do registro OSF e revisão do resumo, da introdução e da discussão
DOI 10.17605/OSF.IO/V82JE na seção 2.4, nos materiais complementares e
nas referências. O problema passa a ser a falta de política que regule o
risco e proteja os entregadores (em pauta está o vínculo), não a falta de
debate sobre quem paga. O resumo descreve o tratamento sem o jargão de
quebra estrutural e explica o que é a CNAE. TeX, DOCX e PDFs gerados de novo.

Co-Authored-By: Claude Opus 5.5 <noreply@anthropic.com>
Claude-Session: https://claude.ai/code/session_01RX7RZhVGPJ1LaoYw9sFqDf
</commit_message>
<xml_diff>
--- a/artigo/artigo.docx
+++ b/artigo/artigo.docx
@@ -293,7 +293,7 @@
         <w:t xml:space="preserve"> </w:t>
       </w:r>
       <w:r>
-        <w:t xml:space="preserve">a expansão das plataformas de entrega com remuneração por corrida coincide com o crescimento das internações de motociclistas no Sistema Único de Saúde (SUS), mas nenhuma base administrativa pública liga uma internação ao trabalho por plataforma, e o debate público trata só do vínculo empregatício, não de quem paga a conta hospitalar.</w:t>
+        <w:t xml:space="preserve">a expansão das plataformas de entrega com remuneração por corrida coincide com o crescimento das internações de motociclistas no Sistema Único de Saúde (SUS), mas nenhuma base administrativa pública liga uma internação ao trabalho por plataforma, e não há política pública permanente que regule esse risco ou proteja os entregadores — o que está em pauta é o vínculo empregatício.</w:t>
       </w:r>
       <w:r>
         <w:t xml:space="preserve"> </w:t>
@@ -325,7 +325,22 @@
         <w:t xml:space="preserve"> </w:t>
       </w:r>
       <w:r>
-        <w:t xml:space="preserve">painel município × mês (2015–2025) montado a partir dos microdados do SIH/SUS (3.563 de 3.564 competências; 433.033 linhas em 5.517 municípios), frota municipal do Senatran, benefícios do INSS, PNAD Contínua e relatórios da Prosus. O tratamento é a quebra estrutural nas aberturas de MEI com CNAE 5320-2/02, detectada por uma regra de teste de Poisson cujos hiperparâmetros foram calibrados por busca em grade contra um placebo pré-plataforma e contra datas externas (Wayback Machine), nunca contra internações. O plano de análise (diferenças em diferenças com adoção escalonada, Callaway &amp; Sant’Anna) foi registrado no OSF antes de qualquer cruzamento tratamento × desfecho.</w:t>
+        <w:t xml:space="preserve">painel município × mês (2015–2025) montado a partir dos microdados do SIH/SUS (3.563 de 3.564 competências; 433.033 linhas em 5.517 municípios), frota municipal do Senatran, benefícios do INSS, PNAD Contínua e relatórios da Prosus. O tratamento é o mês em que, em cada município, as aberturas de microempreendedor individual (MEI) na atividade de entrega dão um salto abrupto, ao menos o dobro do ritmo dos dois anos anteriores. A atividade é identificada pela CNAE (Classificação Nacional de Atividades Econômicas), o código que toda empresa declara à Receita Federal para dizer o que faz; o de entregadores é o 5320-2/02,</w:t>
+      </w:r>
+      <w:r>
+        <w:t xml:space="preserve"> </w:t>
+      </w:r>
+      <w:r>
+        <w:t xml:space="preserve">“</w:t>
+      </w:r>
+      <w:r>
+        <w:t xml:space="preserve">serviços de entrega rápida</w:t>
+      </w:r>
+      <w:r>
+        <w:t xml:space="preserve">”</w:t>
+      </w:r>
+      <w:r>
+        <w:t xml:space="preserve">. O salto é detectado por uma regra baseada em teste de Poisson, cujos parâmetros foram calibrados contra um período anterior às plataformas (placebo) e contra datas de entrada conhecidas (Wayback Machine), nunca contra internações. O plano de análise (diferenças em diferenças com adoção escalonada, Callaway &amp; Sant’Anna) foi registrado no OSF antes de qualquer cruzamento tratamento × desfecho.</w:t>
       </w:r>
       <w:r>
         <w:t xml:space="preserve"> </w:t>
@@ -341,7 +356,7 @@
         <w:t xml:space="preserve"> </w:t>
       </w:r>
       <w:r>
-        <w:t xml:space="preserve">foram 965.714 internações de motociclistas em 2016–2023, das quais 62 (uma em 15.576) registram nexo ocupacional; o SUS pagou R$ 288 milhões com essas internações em 2025, enquanto o resultado operacional do iFood no mesmo ano foi de R$ 1,8 bilhão. A regra de quebra data 640 municípios de 20 a 100 mil habitantes entre 2017 e 2025, com falso positivo de 0,7% a 3,8% no placebo; 478 entram na janela balanceada de estimação. Dois modelos complementares, sem uso do desfecho, avaliam o tratamento: uma simulação de Monte Carlo da regra reproduz o falso positivo observado abaixo de 100 mil habitantes (0,6% e 3,9% simulados contra 0,7% e 3,8% observados) e mostra que a regra é conservadora (detecta 22–54% dos saltos de 2 a 5 vezes em municípios de 50–100 mil); uma regressão logística de seleção (AUC de validação cruzada 0,91) mostra que Nordeste e Norte têm chance 17 a 34 vezes menor de receber data, mesmo controlando população e propensão pré-plataforma a abrir MEI.</w:t>
+        <w:t xml:space="preserve">foram 965.714 internações de motociclistas em 2016–2023, das quais 62 (uma em 15.576) registram nexo ocupacional; o SUS pagou R$ 288 milhões com essas internações em 2025, enquanto o resultado operacional do iFood no mesmo ano foi de R$ 1,8 bilhão. A regra identifica esse salto em 640 municípios de 20 a 100 mil habitantes entre 2017 e 2025, com falso positivo de 0,7% a 3,8% no placebo; 478 entram na janela balanceada de estimação. Dois modelos complementares, sem uso do desfecho, avaliam o tratamento: uma simulação de Monte Carlo da regra reproduz o falso positivo observado abaixo de 100 mil habitantes (0,6% e 3,9% simulados contra 0,7% e 3,8% observados) e mostra que a regra é conservadora (detecta 22–54% dos saltos de 2 a 5 vezes em municípios de 50–100 mil); uma regressão logística de seleção (AUC de validação cruzada 0,91) mostra que Nordeste e Norte têm chance 17 a 34 vezes menor de receber data, mesmo controlando população e propensão pré-plataforma a abrir MEI.</w:t>
       </w:r>
       <w:r>
         <w:t xml:space="preserve"> </w:t>
@@ -485,11 +500,11 @@
         <w:pStyle w:val="BodyText"/>
       </w:pPr>
       <w:r>
-        <w:t xml:space="preserve">A contribuição é dupla. Substantivamente, o debate público brasileiro (PLP 12/2024; julgamento do vínculo no STF, suspenso em junho de 2026) é inteiramente sobre vínculo empregatício; ninguém mede a externalidade fiscal sobre o SUS. Metodologicamente, propomos datar a chegada de uma tecnologia de trabalho não observada por uma quebra estrutural em registros de pessoa jurídica, com hiperparâmetros calibrados contra placebo e validação externa — uma solução reutilizável para outros fenômenos de plataformização.</w:t>
+        <w:t xml:space="preserve">A contribuição é dupla. Substantivamente, o problema é a ausência de regulação: o seguro de acidentes obrigatório da Lei 14.297/2022 valeu só durante a emergência sanitária, e o que está em pauta hoje é o vínculo empregatício, cujo julgamento no STF está suspenso desde junho de 2026. Nenhuma regra em vigor obriga as plataformas a custear o risco de acidente que a remuneração por corrida cria, nem a proteger quem o corre. Este trabalho mede a carga e o custo público desse risco, que é a base que uma política precisa ter. Metodologicamente, propomos datar a chegada de uma tecnologia de trabalho não observada por uma quebra estrutural em registros de pessoa jurídica, com hiperparâmetros calibrados contra placebo e validação externa — uma solução reutilizável para outros fenômenos de plataformização.</w:t>
       </w:r>
     </w:p>
     <w:bookmarkEnd w:id="20"/>
-    <w:bookmarkStart w:id="27" w:name="métodos"/>
+    <w:bookmarkStart w:id="28" w:name="métodos"/>
     <w:p>
       <w:pPr>
         <w:pStyle w:val="Heading1"/>
@@ -2392,7 +2407,7 @@
       </w:r>
     </w:p>
     <w:bookmarkEnd w:id="23"/>
-    <w:bookmarkStart w:id="24" w:name="X683c61a9d6e3855cb875d0d94a0b17131063f5b"/>
+    <w:bookmarkStart w:id="25" w:name="X683c61a9d6e3855cb875d0d94a0b17131063f5b"/>
     <w:p>
       <w:pPr>
         <w:pStyle w:val="Heading2"/>
@@ -2761,7 +2776,84 @@
         <w:t xml:space="preserve">OSF Preregistration</w:t>
       </w:r>
       <w:r>
-        <w:t xml:space="preserve">)</w:t>
+        <w:t xml:space="preserve">) (doi:</w:t>
+      </w:r>
+      <w:r>
+        <w:t xml:space="preserve"> </w:t>
+      </w:r>
+      <w:hyperlink r:id="rId24">
+        <w:r>
+          <w:rPr>
+            <w:rStyle w:val="Hyperlink"/>
+          </w:rPr>
+          <w:t xml:space="preserve">10.17605/OSF.IO/V82JE</w:t>
+        </w:r>
+      </w:hyperlink>
+      <w:r>
+        <w:t xml:space="preserve">), apontando para a tag</w:t>
+      </w:r>
+      <w:r>
+        <w:t xml:space="preserve"> </w:t>
+      </w:r>
+      <w:r>
+        <w:rPr>
+          <w:rStyle w:val="VerbatimChar"/>
+        </w:rPr>
+        <w:t xml:space="preserve">pre-registro-v1</w:t>
+      </w:r>
+      <w:r>
+        <w:t xml:space="preserve"> </w:t>
+      </w:r>
+      <w:r>
+        <w:t xml:space="preserve">do repositório. Todo desvio posterior vai para o log como análise exploratória declarada.</w:t>
+      </w:r>
+    </w:p>
+    <w:bookmarkEnd w:id="25"/>
+    <w:bookmarkStart w:id="26" w:name="avaliação-do-tratamento-auditoria-cega"/>
+    <w:p>
+      <w:pPr>
+        <w:pStyle w:val="Heading2"/>
+      </w:pPr>
+      <w:r>
+        <w:t xml:space="preserve">2.5 Avaliação do tratamento: auditoria cega</w:t>
+      </w:r>
+    </w:p>
+    <w:p>
+      <w:pPr>
+        <w:pStyle w:val="FirstParagraph"/>
+      </w:pPr>
+      <w:r>
+        <w:t xml:space="preserve">A regra de quebra é testada por busca independente: amostra sorteada com semente fixa (20261011) de 6 municípios</w:t>
+      </w:r>
+      <w:r>
+        <w:t xml:space="preserve"> </w:t>
+      </w:r>
+      <w:r>
+        <w:rPr>
+          <w:rStyle w:val="VerbatimChar"/>
+        </w:rPr>
+        <w:t xml:space="preserve">datado</w:t>
+      </w:r>
+      <w:r>
+        <w:t xml:space="preserve"> </w:t>
+      </w:r>
+      <w:r>
+        <w:t xml:space="preserve">por faixa de população em cada estrato de ano (2017; 2018–2020; 2021–2025), 12 iscas</w:t>
+      </w:r>
+      <w:r>
+        <w:t xml:space="preserve"> </w:t>
+      </w:r>
+      <w:r>
+        <w:rPr>
+          <w:rStyle w:val="VerbatimChar"/>
+        </w:rPr>
+        <w:t xml:space="preserve">sem_quebra</w:t>
+      </w:r>
+      <w:r>
+        <w:t xml:space="preserve"> </w:t>
+      </w:r>
+      <w:r>
+        <w:t xml:space="preserve">e as 27 capitais — 75 municípios, numa lista única. Dois codificadores, cegos ao SIH, à data da quebra e ao grupo, datam a entrada das plataformas pelo protocolo v1.1. Concorda a quebra que cai no intervalo codificado ±6 meses; o estrato passa com</w:t>
       </w:r>
       <w:r>
         <w:t xml:space="preserve"> </w:t>
@@ -2771,73 +2863,13 @@
           <w:bCs/>
           <w:b/>
         </w:rPr>
-        <w:t xml:space="preserve">[DOI/URL DO REGISTRO OSF]</w:t>
-      </w:r>
-      <w:r>
-        <w:t xml:space="preserve">, apontando para a tag</w:t>
-      </w:r>
-      <w:r>
-        <w:t xml:space="preserve"> </w:t>
-      </w:r>
-      <w:r>
-        <w:rPr>
-          <w:rStyle w:val="VerbatimChar"/>
-        </w:rPr>
-        <w:t xml:space="preserve">pre-registro-v1</w:t>
-      </w:r>
-      <w:r>
-        <w:t xml:space="preserve"> </w:t>
-      </w:r>
-      <w:r>
-        <w:t xml:space="preserve">do repositório. Todo desvio posterior vai para o log como análise exploratória declarada.</w:t>
-      </w:r>
-    </w:p>
-    <w:bookmarkEnd w:id="24"/>
-    <w:bookmarkStart w:id="25" w:name="avaliação-do-tratamento-auditoria-cega"/>
-    <w:p>
-      <w:pPr>
-        <w:pStyle w:val="Heading2"/>
-      </w:pPr>
-      <w:r>
-        <w:t xml:space="preserve">2.5 Avaliação do tratamento: auditoria cega</w:t>
-      </w:r>
-    </w:p>
-    <w:p>
-      <w:pPr>
-        <w:pStyle w:val="FirstParagraph"/>
-      </w:pPr>
-      <w:r>
-        <w:t xml:space="preserve">A regra de quebra é testada por busca independente: amostra sorteada com semente fixa (20261011) de 6 municípios</w:t>
-      </w:r>
-      <w:r>
-        <w:t xml:space="preserve"> </w:t>
-      </w:r>
-      <w:r>
-        <w:rPr>
-          <w:rStyle w:val="VerbatimChar"/>
-        </w:rPr>
-        <w:t xml:space="preserve">datado</w:t>
-      </w:r>
-      <w:r>
-        <w:t xml:space="preserve"> </w:t>
-      </w:r>
-      <w:r>
-        <w:t xml:space="preserve">por faixa de população em cada estrato de ano (2017; 2018–2020; 2021–2025), 12 iscas</w:t>
-      </w:r>
-      <w:r>
-        <w:t xml:space="preserve"> </w:t>
-      </w:r>
-      <w:r>
-        <w:rPr>
-          <w:rStyle w:val="VerbatimChar"/>
-        </w:rPr>
-        <w:t xml:space="preserve">sem_quebra</w:t>
-      </w:r>
-      <w:r>
-        <w:t xml:space="preserve"> </w:t>
-      </w:r>
-      <w:r>
-        <w:t xml:space="preserve">e as 27 capitais — 75 municípios, numa lista única. Dois codificadores, cegos ao SIH, à data da quebra e ao grupo, datam a entrada das plataformas pelo protocolo v1.1. Concorda a quebra que cai no intervalo codificado ±6 meses; o estrato passa com</w:t>
+        <w:t xml:space="preserve">taxa de coincidência</w:t>
+      </w:r>
+      <w:r>
+        <w:t xml:space="preserve"> </w:t>
+      </w:r>
+      <w:r>
+        <w:t xml:space="preserve">(concordantes sobre achados) de ao menos 2/3, e é inconclusivo — não auditado — com menos de 6 achados. Não encontrar evidência é resultado previsto em municípios pequenos, e não conta contra nem a favor da regra: por isso cada estrato reporta também a</w:t>
       </w:r>
       <w:r>
         <w:t xml:space="preserve"> </w:t>
@@ -2847,22 +2879,6 @@
           <w:bCs/>
           <w:b/>
         </w:rPr>
-        <w:t xml:space="preserve">taxa de coincidência</w:t>
-      </w:r>
-      <w:r>
-        <w:t xml:space="preserve"> </w:t>
-      </w:r>
-      <w:r>
-        <w:t xml:space="preserve">(concordantes sobre achados) de ao menos 2/3, e é inconclusivo — não auditado — com menos de 6 achados. Não encontrar evidência é resultado previsto em municípios pequenos, e não conta contra nem a favor da regra: por isso cada estrato reporta também a</w:t>
-      </w:r>
-      <w:r>
-        <w:t xml:space="preserve"> </w:t>
-      </w:r>
-      <w:r>
-        <w:rPr>
-          <w:bCs/>
-          <w:b/>
-        </w:rPr>
         <w:t xml:space="preserve">taxa de achado</w:t>
       </w:r>
       <w:r>
@@ -2887,8 +2903,8 @@
         <w:t xml:space="preserve">) foram escritas antes da auditoria começar.</w:t>
       </w:r>
     </w:p>
-    <w:bookmarkEnd w:id="25"/>
-    <w:bookmarkStart w:id="26" w:name="Xf2d9e1919c82b4317694da72f270f723557bb59"/>
+    <w:bookmarkEnd w:id="26"/>
+    <w:bookmarkStart w:id="27" w:name="Xf2d9e1919c82b4317694da72f270f723557bb59"/>
     <w:p>
       <w:pPr>
         <w:pStyle w:val="Heading2"/>
@@ -3084,9 +3100,9 @@
         <w:t xml:space="preserve">são bons controles.</w:t>
       </w:r>
     </w:p>
-    <w:bookmarkEnd w:id="26"/>
     <w:bookmarkEnd w:id="27"/>
-    <w:bookmarkStart w:id="52" w:name="resultados"/>
+    <w:bookmarkEnd w:id="28"/>
+    <w:bookmarkStart w:id="53" w:name="resultados"/>
     <w:p>
       <w:pPr>
         <w:pStyle w:val="Heading1"/>
@@ -3116,7 +3132,7 @@
         <w:t xml:space="preserve">, por regra do pré-registro.</w:t>
       </w:r>
     </w:p>
-    <w:bookmarkStart w:id="28" w:name="carga-e-custo-público"/>
+    <w:bookmarkStart w:id="29" w:name="carga-e-custo-público"/>
     <w:p>
       <w:pPr>
         <w:pStyle w:val="Heading2"/>
@@ -3167,8 +3183,8 @@
         <w:t xml:space="preserve">O valor pago é piso: a tabela SUS remunera abaixo do custo, e o componente hospitalar por ferido grave nos parâmetros do Ipea (TD 2565) é duas ordens de grandeza maior que o valor médio da AIH. Por isso o custo social (Ipea) é reportado à parte, como ordem de grandeza, e nunca somado ao valor pago.</w:t>
       </w:r>
     </w:p>
-    <w:bookmarkEnd w:id="28"/>
-    <w:bookmarkStart w:id="32" w:name="invisibilidade-ocupacional"/>
+    <w:bookmarkEnd w:id="29"/>
+    <w:bookmarkStart w:id="33" w:name="invisibilidade-ocupacional"/>
     <w:p>
       <w:pPr>
         <w:pStyle w:val="Heading2"/>
@@ -3241,18 +3257,18 @@
           <wp:inline>
             <wp:extent cx="4533900" cy="1660363"/>
             <wp:effectExtent b="0" l="0" r="0" t="0"/>
-            <wp:docPr descr="Uma internação de motociclista em 15.576 registra o trabalho como causa (SIH/SUS, 2016–2023)." title="" id="30" name="Picture"/>
+            <wp:docPr descr="Uma internação de motociclista em 15.576 registra o trabalho como causa (SIH/SUS, 2016–2023)." title="" id="31" name="Picture"/>
             <a:graphic>
               <a:graphicData uri="http://schemas.openxmlformats.org/drawingml/2006/picture">
                 <pic:pic>
                   <pic:nvPicPr>
-                    <pic:cNvPr descr="figuras/fig4_nexo.png" id="31" name="Picture"/>
+                    <pic:cNvPr descr="figuras/fig4_nexo.png" id="32" name="Picture"/>
                     <pic:cNvPicPr>
                       <a:picLocks noChangeArrowheads="1" noChangeAspect="1"/>
                     </pic:cNvPicPr>
                   </pic:nvPicPr>
                   <pic:blipFill>
-                    <a:blip r:embed="rId29"/>
+                    <a:blip r:embed="rId30"/>
                     <a:stretch>
                       <a:fillRect/>
                     </a:stretch>
@@ -3308,8 +3324,8 @@
         <w:t xml:space="preserve">, não de mudança de risco: a partir de nov/2023 a concessão por análise documental (Atestmed) passa a dominar, e o atestado registra o código V muito mais que a perícia (0,6–0,7 contra 0,03–0,13 por mil benefícios). Esse canal responde por 65% dos benefícios de motociclistas em 2024–2025; anos dos dois lados da quebra não se comparam pelo total.</w:t>
       </w:r>
     </w:p>
-    <w:bookmarkEnd w:id="32"/>
-    <w:bookmarkStart w:id="36" w:name="precariedade-e-lucro"/>
+    <w:bookmarkEnd w:id="33"/>
+    <w:bookmarkStart w:id="37" w:name="precariedade-e-lucro"/>
     <w:p>
       <w:pPr>
         <w:pStyle w:val="Heading2"/>
@@ -3710,18 +3726,18 @@
           <wp:inline>
             <wp:extent cx="5334000" cy="2274875"/>
             <wp:effectExtent b="0" l="0" r="0" t="0"/>
-            <wp:docPr descr="iFood segundo as planilhas de KPI da Prosus: resultado operacional em R$ de dez/2025 (esq.) e entregadores ativos e pedidos (dir.), por ano fiscal abril–março. A série de resultado emenda trading profit (até FY2024) e EBIT ajustado (a partir de FY2025)." title="" id="34" name="Picture"/>
+            <wp:docPr descr="iFood segundo as planilhas de KPI da Prosus: resultado operacional em R$ de dez/2025 (esq.) e entregadores ativos e pedidos (dir.), por ano fiscal abril–março. A série de resultado emenda trading profit (até FY2024) e EBIT ajustado (a partir de FY2025)." title="" id="35" name="Picture"/>
             <a:graphic>
               <a:graphicData uri="http://schemas.openxmlformats.org/drawingml/2006/picture">
                 <pic:pic>
                   <pic:nvPicPr>
-                    <pic:cNvPr descr="figuras/fig3_ifood.png" id="35" name="Picture"/>
+                    <pic:cNvPr descr="figuras/fig3_ifood.png" id="36" name="Picture"/>
                     <pic:cNvPicPr>
                       <a:picLocks noChangeArrowheads="1" noChangeAspect="1"/>
                     </pic:cNvPicPr>
                   </pic:nvPicPr>
                   <pic:blipFill>
-                    <a:blip r:embed="rId33"/>
+                    <a:blip r:embed="rId34"/>
                     <a:stretch>
                       <a:fillRect/>
                     </a:stretch>
@@ -3796,8 +3812,8 @@
         <w:t xml:space="preserve">o que o SUS pagou com todas as internações de motociclistas do país no mesmo ano (R$ 288 milhões, ambos em R$ de dez/2025). Com ~1,7 bilhão de pedidos no ano, menos de R$ 0,20 por pedido cobriria essa conta. Esse número dimensiona uma política, mas não a justifica: a fração das internações atribuível à plataforma é exatamente o que a estimação causal vai medir.</w:t>
       </w:r>
     </w:p>
-    <w:bookmarkEnd w:id="36"/>
-    <w:bookmarkStart w:id="43" w:name="o-tratamento-construído"/>
+    <w:bookmarkEnd w:id="37"/>
+    <w:bookmarkStart w:id="44" w:name="o-tratamento-construído"/>
     <w:p>
       <w:pPr>
         <w:pStyle w:val="Heading2"/>
@@ -4354,18 +4370,18 @@
           <wp:inline>
             <wp:extent cx="5067300" cy="2681622"/>
             <wp:effectExtent b="0" l="0" r="0" t="0"/>
-            <wp:docPr descr="Ano da quebra nos 640 municípios datado. Faixa cinza escura: 2017, estrato de risco de quebra espúria (antes da frota própria do iFood); cinza claro: 2021–2025, risco de contaminação pela entrega de comércio eletrônico." title="" id="38" name="Picture"/>
+            <wp:docPr descr="Ano da quebra nos 640 municípios datado. Faixa cinza escura: 2017, estrato de risco de quebra espúria (antes da frota própria do iFood); cinza claro: 2021–2025, risco de contaminação pela entrega de comércio eletrônico." title="" id="39" name="Picture"/>
             <a:graphic>
               <a:graphicData uri="http://schemas.openxmlformats.org/drawingml/2006/picture">
                 <pic:pic>
                   <pic:nvPicPr>
-                    <pic:cNvPr descr="figuras/fig1_coortes.png" id="39" name="Picture"/>
+                    <pic:cNvPr descr="figuras/fig1_coortes.png" id="40" name="Picture"/>
                     <pic:cNvPicPr>
                       <a:picLocks noChangeArrowheads="1" noChangeAspect="1"/>
                     </pic:cNvPicPr>
                   </pic:nvPicPr>
                   <pic:blipFill>
-                    <a:blip r:embed="rId37"/>
+                    <a:blip r:embed="rId38"/>
                     <a:stretch>
                       <a:fillRect/>
                     </a:stretch>
@@ -4461,18 +4477,18 @@
           <wp:inline>
             <wp:extent cx="5065776" cy="2566416"/>
             <wp:effectExtent b="0" l="0" r="0" t="0"/>
-            <wp:docPr descr="Proporção acumulada de municípios de 20–100 mil habitantes já tratados. Em verde, as coortes que cabem na janela balanceada de estimação." title="" id="41" name="Picture"/>
+            <wp:docPr descr="Proporção acumulada de municípios de 20–100 mil habitantes já tratados. Em verde, as coortes que cabem na janela balanceada de estimação." title="" id="42" name="Picture"/>
             <a:graphic>
               <a:graphicData uri="http://schemas.openxmlformats.org/drawingml/2006/picture">
                 <pic:pic>
                   <pic:nvPicPr>
-                    <pic:cNvPr descr="figuras/fig2_adocao_acumulada.png" id="42" name="Picture"/>
+                    <pic:cNvPr descr="figuras/fig2_adocao_acumulada.png" id="43" name="Picture"/>
                     <pic:cNvPicPr>
                       <a:picLocks noChangeArrowheads="1" noChangeAspect="1"/>
                     </pic:cNvPicPr>
                   </pic:nvPicPr>
                   <pic:blipFill>
-                    <a:blip r:embed="rId40"/>
+                    <a:blip r:embed="rId41"/>
                     <a:stretch>
                       <a:fillRect/>
                     </a:stretch>
@@ -5002,8 +5018,8 @@
         <w:t xml:space="preserve">nordestinos estaria tratada sem ser vista. A seção 4 discute a consequência.</w:t>
       </w:r>
     </w:p>
-    <w:bookmarkEnd w:id="43"/>
-    <w:bookmarkStart w:id="47" w:name="X6b778cbaed6e943f7b53f3a5497b82e1877f970"/>
+    <w:bookmarkEnd w:id="44"/>
+    <w:bookmarkStart w:id="48" w:name="X6b778cbaed6e943f7b53f3a5497b82e1877f970"/>
     <w:p>
       <w:pPr>
         <w:pStyle w:val="Heading2"/>
@@ -5369,18 +5385,18 @@
           <wp:inline>
             <wp:extent cx="5334000" cy="2245894"/>
             <wp:effectExtent b="0" l="0" r="0" t="0"/>
-            <wp:docPr descr="Simulação de Monte Carlo da regra de quebra. Esquerda: falso positivo na janela do placebo sob nulo de Poisson e gama-Poisson, contra o observado. Direita: proporção de saltos de r vezes na taxa de aberturas corretamente datados (de 5 meses antes a 12 meses depois do salto), por faixa." title="" id="45" name="Picture"/>
+            <wp:docPr descr="Simulação de Monte Carlo da regra de quebra. Esquerda: falso positivo na janela do placebo sob nulo de Poisson e gama-Poisson, contra o observado. Direita: proporção de saltos de r vezes na taxa de aberturas corretamente datados (de 5 meses antes a 12 meses depois do salto), por faixa." title="" id="46" name="Picture"/>
             <a:graphic>
               <a:graphicData uri="http://schemas.openxmlformats.org/drawingml/2006/picture">
                 <pic:pic>
                   <pic:nvPicPr>
-                    <pic:cNvPr descr="figuras/fig5_simulacao_regra.png" id="46" name="Picture"/>
+                    <pic:cNvPr descr="figuras/fig5_simulacao_regra.png" id="47" name="Picture"/>
                     <pic:cNvPicPr>
                       <a:picLocks noChangeArrowheads="1" noChangeAspect="1"/>
                     </pic:cNvPicPr>
                   </pic:nvPicPr>
                   <pic:blipFill>
-                    <a:blip r:embed="rId44"/>
+                    <a:blip r:embed="rId45"/>
                     <a:stretch>
                       <a:fillRect/>
                     </a:stretch>
@@ -5738,8 +5754,8 @@
         <w:t xml:space="preserve">do grupo de comparação.</w:t>
       </w:r>
     </w:p>
-    <w:bookmarkEnd w:id="47"/>
-    <w:bookmarkStart w:id="51" w:name="Xf1cfce79b642304067e12cc1204dd68e475de48"/>
+    <w:bookmarkEnd w:id="48"/>
+    <w:bookmarkStart w:id="52" w:name="Xf1cfce79b642304067e12cc1204dd68e475de48"/>
     <w:p>
       <w:pPr>
         <w:pStyle w:val="Heading2"/>
@@ -6263,18 +6279,18 @@
           <wp:inline>
             <wp:extent cx="5067300" cy="2423491"/>
             <wp:effectExtent b="0" l="0" r="0" t="0"/>
-            <wp:docPr descr="Razões de chance de receber data, por região (referência: Sudeste), antes (M2) e depois (M3) de controlar a propensão pré-plataforma a abrir MEI de entrega. Escala logarítmica; IC 95% com erros agrupados por UF." title="" id="49" name="Picture"/>
+            <wp:docPr descr="Razões de chance de receber data, por região (referência: Sudeste), antes (M2) e depois (M3) de controlar a propensão pré-plataforma a abrir MEI de entrega. Escala logarítmica; IC 95% com erros agrupados por UF." title="" id="50" name="Picture"/>
             <a:graphic>
               <a:graphicData uri="http://schemas.openxmlformats.org/drawingml/2006/picture">
                 <pic:pic>
                   <pic:nvPicPr>
-                    <pic:cNvPr descr="figuras/fig6_selecao.png" id="50" name="Picture"/>
+                    <pic:cNvPr descr="figuras/fig6_selecao.png" id="51" name="Picture"/>
                     <pic:cNvPicPr>
                       <a:picLocks noChangeArrowheads="1" noChangeAspect="1"/>
                     </pic:cNvPicPr>
                   </pic:nvPicPr>
                   <pic:blipFill>
-                    <a:blip r:embed="rId48"/>
+                    <a:blip r:embed="rId49"/>
                     <a:stretch>
                       <a:fillRect/>
                     </a:stretch>
@@ -6349,9 +6365,9 @@
         <w:t xml:space="preserve">mistura regiões com trajetórias distintas.</w:t>
       </w:r>
     </w:p>
-    <w:bookmarkEnd w:id="51"/>
     <w:bookmarkEnd w:id="52"/>
-    <w:bookmarkStart w:id="53" w:name="discussão"/>
+    <w:bookmarkEnd w:id="53"/>
+    <w:bookmarkStart w:id="54" w:name="discussão"/>
     <w:p>
       <w:pPr>
         <w:pStyle w:val="Heading1"/>
@@ -6616,11 +6632,11 @@
         <w:t xml:space="preserve"> </w:t>
       </w:r>
       <w:r>
-        <w:t xml:space="preserve">O debate brasileiro é sobre vínculo; a externalidade fiscal não depende dele. Se H1 for sustentada, a fração atribuível dá a base de cálculo para uma contribuição acidentária das plataformas sobre o valor das corridas — equivalente funcional do RAT —, ou um repasse por corrida ao SUS no molde do que o DPVAT fazia. Se não for, a invisibilidade documentada aqui continua sendo, sozinha, argumento para mudar o registro.</w:t>
-      </w:r>
-    </w:p>
-    <w:bookmarkEnd w:id="53"/>
-    <w:bookmarkStart w:id="54" w:name="conclusão"/>
+        <w:t xml:space="preserve">A falta de regulação não depende de decidir o vínculo: a externalidade fiscal existe com ou sem ele. Se H1 for sustentada, a fração atribuível dá a base de cálculo para uma contribuição acidentária das plataformas sobre o valor das corridas — equivalente funcional do RAT —, ou um repasse por corrida ao SUS no molde do que o DPVAT fazia. Se não for, a invisibilidade documentada aqui continua sendo, sozinha, argumento para mudar o registro.</w:t>
+      </w:r>
+    </w:p>
+    <w:bookmarkEnd w:id="54"/>
+    <w:bookmarkStart w:id="55" w:name="conclusão"/>
     <w:p>
       <w:pPr>
         <w:pStyle w:val="Heading1"/>
@@ -6652,8 +6668,8 @@
         <w:t xml:space="preserve">contêm tratados não detectados, o que torna o efeito estimado um piso por mais uma razão; (3) a seleção ao tratamento é fortemente regional e não se explica por porte nem por formalização prévia, o que pede comparações dentro da região. O terceiro objetivo está especificado e travado em pré-registro; a estimação causal, com essas duas especificações regionais como exploratórias declaradas, e a auditoria cega do tratamento são as próximas etapas.</w:t>
       </w:r>
     </w:p>
-    <w:bookmarkEnd w:id="54"/>
-    <w:bookmarkStart w:id="55" w:name="materiais-complementares"/>
+    <w:bookmarkEnd w:id="55"/>
+    <w:bookmarkStart w:id="56" w:name="materiais-complementares"/>
     <w:p>
       <w:pPr>
         <w:pStyle w:val="Heading1"/>
@@ -7000,18 +7016,19 @@
         <w:t xml:space="preserve"> </w:t>
       </w:r>
       <w:r>
-        <w:t xml:space="preserve">OSF</w:t>
-      </w:r>
-      <w:r>
-        <w:t xml:space="preserve"> </w:t>
-      </w:r>
-      <w:r>
-        <w:rPr>
-          <w:bCs/>
-          <w:b/>
-        </w:rPr>
-        <w:t xml:space="preserve">[DOI/URL]</w:t>
-      </w:r>
+        <w:t xml:space="preserve">OSF, doi:</w:t>
+      </w:r>
+      <w:r>
+        <w:t xml:space="preserve"> </w:t>
+      </w:r>
+      <w:hyperlink r:id="rId24">
+        <w:r>
+          <w:rPr>
+            <w:rStyle w:val="Hyperlink"/>
+          </w:rPr>
+          <w:t xml:space="preserve">10.17605/OSF.IO/V82JE</w:t>
+        </w:r>
+      </w:hyperlink>
       <w:r>
         <w:t xml:space="preserve">; texto do formulário em</w:t>
       </w:r>
@@ -7059,8 +7076,8 @@
         <w:t xml:space="preserve">).</w:t>
       </w:r>
     </w:p>
-    <w:bookmarkEnd w:id="55"/>
-    <w:bookmarkStart w:id="56" w:name="declaração-de-uso-de-ia-generativa"/>
+    <w:bookmarkEnd w:id="56"/>
+    <w:bookmarkStart w:id="57" w:name="declaração-de-uso-de-ia-generativa"/>
     <w:p>
       <w:pPr>
         <w:pStyle w:val="Heading1"/>
@@ -7087,8 +7104,8 @@
         <w:t xml:space="preserve">[AJUSTAR CONFORME O USO EFETIVO DA EQUIPE]</w:t>
       </w:r>
     </w:p>
-    <w:bookmarkEnd w:id="56"/>
-    <w:bookmarkStart w:id="57" w:name="referências"/>
+    <w:bookmarkEnd w:id="57"/>
+    <w:bookmarkStart w:id="58" w:name="referências"/>
     <w:p>
       <w:pPr>
         <w:pStyle w:val="Heading1"/>
@@ -7257,7 +7274,7 @@
         <w:pStyle w:val="BodyText"/>
       </w:pPr>
       <w:r>
-        <w:t xml:space="preserve">PROSUS N.V.</w:t>
+        <w:t xml:space="preserve">[NOMES DOS AUTORES].</w:t>
       </w:r>
       <w:r>
         <w:t xml:space="preserve"> </w:t>
@@ -7267,22 +7284,10 @@
           <w:iCs/>
           <w:i/>
         </w:rPr>
-        <w:t xml:space="preserve">KPI datasheets</w:t>
-      </w:r>
-      <w:r>
-        <w:t xml:space="preserve">, anos fiscais 2021 a 2026. Amsterdã: Prosus. Disponível em: prosus.com (URLs por célula em</w:t>
-      </w:r>
-      <w:r>
-        <w:t xml:space="preserve"> </w:t>
-      </w:r>
-      <w:r>
-        <w:rPr>
-          <w:rStyle w:val="VerbatimChar"/>
-        </w:rPr>
-        <w:t xml:space="preserve">docs/fontes/ifood_prosus.csv</w:t>
-      </w:r>
-      <w:r>
-        <w:t xml:space="preserve">).</w:t>
+        <w:t xml:space="preserve">Delivery platforms and motorcyclist hospitalizations in Brazil’s public health system (SUS): the effect of entry in Brazilian municipalities</w:t>
+      </w:r>
+      <w:r>
+        <w:t xml:space="preserve">. Preregistration. OSF Registries, 2026. DOI: 10.17605/OSF.IO/V82JE.</w:t>
       </w:r>
     </w:p>
     <w:p>
@@ -7290,7 +7295,7 @@
         <w:pStyle w:val="BodyText"/>
       </w:pPr>
       <w:r>
-        <w:t xml:space="preserve">ROTH, J. et al. What’s trending in difference-in-differences? A synthesis of the recent econometrics literature.</w:t>
+        <w:t xml:space="preserve">PROSUS N.V.</w:t>
       </w:r>
       <w:r>
         <w:t xml:space="preserve"> </w:t>
@@ -7300,10 +7305,22 @@
           <w:iCs/>
           <w:i/>
         </w:rPr>
-        <w:t xml:space="preserve">Journal of Econometrics</w:t>
-      </w:r>
-      <w:r>
-        <w:t xml:space="preserve">, v. 235, n. 2, p. 2218–2244, 2023.</w:t>
+        <w:t xml:space="preserve">KPI datasheets</w:t>
+      </w:r>
+      <w:r>
+        <w:t xml:space="preserve">, anos fiscais 2021 a 2026. Amsterdã: Prosus. Disponível em: prosus.com (URLs por célula em</w:t>
+      </w:r>
+      <w:r>
+        <w:t xml:space="preserve"> </w:t>
+      </w:r>
+      <w:r>
+        <w:rPr>
+          <w:rStyle w:val="VerbatimChar"/>
+        </w:rPr>
+        <w:t xml:space="preserve">docs/fontes/ifood_prosus.csv</w:t>
+      </w:r>
+      <w:r>
+        <w:t xml:space="preserve">).</w:t>
       </w:r>
     </w:p>
     <w:p>
@@ -7311,7 +7328,7 @@
         <w:pStyle w:val="BodyText"/>
       </w:pPr>
       <w:r>
-        <w:t xml:space="preserve">SUN, L.; ABRAHAM, S. Estimating dynamic treatment effects in event studies with heterogeneous treatment effects.</w:t>
+        <w:t xml:space="preserve">ROTH, J. et al. What’s trending in difference-in-differences? A synthesis of the recent econometrics literature.</w:t>
       </w:r>
       <w:r>
         <w:t xml:space="preserve"> </w:t>
@@ -7324,10 +7341,31 @@
         <w:t xml:space="preserve">Journal of Econometrics</w:t>
       </w:r>
       <w:r>
+        <w:t xml:space="preserve">, v. 235, n. 2, p. 2218–2244, 2023.</w:t>
+      </w:r>
+    </w:p>
+    <w:p>
+      <w:pPr>
+        <w:pStyle w:val="BodyText"/>
+      </w:pPr>
+      <w:r>
+        <w:t xml:space="preserve">SUN, L.; ABRAHAM, S. Estimating dynamic treatment effects in event studies with heterogeneous treatment effects.</w:t>
+      </w:r>
+      <w:r>
+        <w:t xml:space="preserve"> </w:t>
+      </w:r>
+      <w:r>
+        <w:rPr>
+          <w:iCs/>
+          <w:i/>
+        </w:rPr>
+        <w:t xml:space="preserve">Journal of Econometrics</w:t>
+      </w:r>
+      <w:r>
         <w:t xml:space="preserve">, v. 225, n. 2, p. 175–199, 2021.</w:t>
       </w:r>
     </w:p>
-    <w:bookmarkEnd w:id="57"/>
+    <w:bookmarkEnd w:id="58"/>
     <w:sectPr/>
   </w:body>
 </w:document>

</xml_diff>